<commit_message>
Commit:Práctica Aprendizaje MySQL BDR-P2-P03
Trabajé con Rodríguez Morales Gilberto
</commit_message>
<xml_diff>
--- a/EvaluacionAprendizajeMySQL.docx
+++ b/EvaluacionAprendizajeMySQL.docx
@@ -1,6 +1,6 @@
 
 <file path=word/document.xml><?xml version="1.0" encoding="utf-8"?>
-<w:document xmlns:wpc="http://schemas.microsoft.com/office/word/2010/wordprocessingCanvas" xmlns:cx="http://schemas.microsoft.com/office/drawing/2014/chartex" xmlns:mc="http://schemas.openxmlformats.org/markup-compatibility/2006" xmlns:o="urn:schemas-microsoft-com:office:office" xmlns:r="http://schemas.openxmlformats.org/officeDocument/2006/relationships" xmlns:m="http://schemas.openxmlformats.org/officeDocument/2006/math" xmlns:v="urn:schemas-microsoft-com:vml" xmlns:wp14="http://schemas.microsoft.com/office/word/2010/wordprocessingDrawing" xmlns:wp="http://schemas.openxmlformats.org/drawingml/2006/wordprocessingDrawing" xmlns:w10="urn:schemas-microsoft-com:office:word" xmlns:w="http://schemas.openxmlformats.org/wordprocessingml/2006/main" xmlns:w14="http://schemas.microsoft.com/office/word/2010/wordml" xmlns:w15="http://schemas.microsoft.com/office/word/2012/wordml" xmlns:w16se="http://schemas.microsoft.com/office/word/2015/wordml/symex" xmlns:wpg="http://schemas.microsoft.com/office/word/2010/wordprocessingGroup" xmlns:wpi="http://schemas.microsoft.com/office/word/2010/wordprocessingInk" xmlns:wne="http://schemas.microsoft.com/office/word/2006/wordml" xmlns:wps="http://schemas.microsoft.com/office/word/2010/wordprocessingShape" mc:Ignorable="w14 w15 w16se wp14">
+<w:document xmlns:wpc="http://schemas.microsoft.com/office/word/2010/wordprocessingCanvas" xmlns:cx="http://schemas.microsoft.com/office/drawing/2014/chartex" xmlns:cx1="http://schemas.microsoft.com/office/drawing/2015/9/8/chartex" xmlns:cx2="http://schemas.microsoft.com/office/drawing/2015/10/21/chartex" xmlns:cx3="http://schemas.microsoft.com/office/drawing/2016/5/9/chartex" xmlns:cx4="http://schemas.microsoft.com/office/drawing/2016/5/10/chartex" xmlns:cx5="http://schemas.microsoft.com/office/drawing/2016/5/11/chartex" xmlns:cx6="http://schemas.microsoft.com/office/drawing/2016/5/12/chartex" xmlns:cx7="http://schemas.microsoft.com/office/drawing/2016/5/13/chartex" xmlns:cx8="http://schemas.microsoft.com/office/drawing/2016/5/14/chartex" xmlns:mc="http://schemas.openxmlformats.org/markup-compatibility/2006" xmlns:aink="http://schemas.microsoft.com/office/drawing/2016/ink" xmlns:am3d="http://schemas.microsoft.com/office/drawing/2017/model3d" xmlns:o="urn:schemas-microsoft-com:office:office" xmlns:r="http://schemas.openxmlformats.org/officeDocument/2006/relationships" xmlns:m="http://schemas.openxmlformats.org/officeDocument/2006/math" xmlns:v="urn:schemas-microsoft-com:vml" xmlns:wp14="http://schemas.microsoft.com/office/word/2010/wordprocessingDrawing" xmlns:wp="http://schemas.openxmlformats.org/drawingml/2006/wordprocessingDrawing" xmlns:w10="urn:schemas-microsoft-com:office:word" xmlns:w="http://schemas.openxmlformats.org/wordprocessingml/2006/main" xmlns:w14="http://schemas.microsoft.com/office/word/2010/wordml" xmlns:w15="http://schemas.microsoft.com/office/word/2012/wordml" xmlns:w16cex="http://schemas.microsoft.com/office/word/2018/wordml/cex" xmlns:w16cid="http://schemas.microsoft.com/office/word/2016/wordml/cid" xmlns:w16="http://schemas.microsoft.com/office/word/2018/wordml" xmlns:w16sdtdh="http://schemas.microsoft.com/office/word/2020/wordml/sdtdatahash" xmlns:w16se="http://schemas.microsoft.com/office/word/2015/wordml/symex" xmlns:wpg="http://schemas.microsoft.com/office/word/2010/wordprocessingGroup" xmlns:wpi="http://schemas.microsoft.com/office/word/2010/wordprocessingInk" xmlns:wne="http://schemas.microsoft.com/office/word/2006/wordml" xmlns:wps="http://schemas.microsoft.com/office/word/2010/wordprocessingShape" mc:Ignorable="w14 w15 w16se w16cid w16 w16cex w16sdtdh wp14">
   <w:body>
     <w:p>
       <w:pPr>
@@ -706,8 +706,6 @@
       <w:r>
         <w:br w:type="page"/>
       </w:r>
-      <w:bookmarkStart w:id="0" w:name="_GoBack"/>
-      <w:bookmarkEnd w:id="0"/>
     </w:p>
     <w:tbl>
       <w:tblPr>
@@ -854,10 +852,7 @@
         <w:spacing w:before="60" w:after="80"/>
       </w:pPr>
       <w:r>
-        <w:t xml:space="preserve">Catálogo de géneros </w:t>
-      </w:r>
-      <w:r>
-        <w:t>de videojuegos (Acción, RPG, Deportes, etc.).</w:t>
+        <w:t>Catálogo de géneros de videojuegos (Acción, RPG, Deportes, etc.).</w:t>
       </w:r>
     </w:p>
     <w:p>
@@ -1044,6 +1039,7 @@
             </w:tcMar>
           </w:tcPr>
           <w:p>
+            <w:proofErr w:type="spellStart"/>
             <w:r>
               <w:rPr>
                 <w:sz w:val="20"/>
@@ -1051,6 +1047,7 @@
               </w:rPr>
               <w:t>id_genero</w:t>
             </w:r>
+            <w:proofErr w:type="spellEnd"/>
           </w:p>
         </w:tc>
         <w:tc>
@@ -1181,12 +1178,21 @@
             </w:tcMar>
           </w:tcPr>
           <w:p>
-            <w:r>
-              <w:rPr>
-                <w:sz w:val="20"/>
-                <w:szCs w:val="20"/>
-              </w:rPr>
-              <w:t>VARCHAR(50)</w:t>
+            <w:proofErr w:type="gramStart"/>
+            <w:r>
+              <w:rPr>
+                <w:sz w:val="20"/>
+                <w:szCs w:val="20"/>
+              </w:rPr>
+              <w:t>VARCHAR(</w:t>
+            </w:r>
+            <w:proofErr w:type="gramEnd"/>
+            <w:r>
+              <w:rPr>
+                <w:sz w:val="20"/>
+                <w:szCs w:val="20"/>
+              </w:rPr>
+              <w:t>50)</w:t>
             </w:r>
           </w:p>
         </w:tc>
@@ -1256,6 +1262,7 @@
             </w:tcMar>
           </w:tcPr>
           <w:p>
+            <w:proofErr w:type="spellStart"/>
             <w:r>
               <w:rPr>
                 <w:sz w:val="20"/>
@@ -1263,6 +1270,7 @@
               </w:rPr>
               <w:t>descripcion</w:t>
             </w:r>
+            <w:proofErr w:type="spellEnd"/>
           </w:p>
         </w:tc>
         <w:tc>
@@ -1355,15 +1363,7 @@
           <w:bCs/>
           <w:color w:val="2E6DA4"/>
         </w:rPr>
-        <w:t xml:space="preserve">Tabla 2 — </w:t>
-      </w:r>
-      <w:r>
-        <w:rPr>
-          <w:b/>
-          <w:bCs/>
-          <w:color w:val="2E6DA4"/>
-        </w:rPr>
-        <w:t>PLATAFORMA</w:t>
+        <w:t>Tabla 2 — PLATAFORMA</w:t>
       </w:r>
     </w:p>
     <w:p>
@@ -1558,6 +1558,7 @@
             </w:tcMar>
           </w:tcPr>
           <w:p>
+            <w:proofErr w:type="spellStart"/>
             <w:r>
               <w:rPr>
                 <w:sz w:val="20"/>
@@ -1565,6 +1566,7 @@
               </w:rPr>
               <w:t>id_plataforma</w:t>
             </w:r>
+            <w:proofErr w:type="spellEnd"/>
           </w:p>
         </w:tc>
         <w:tc>
@@ -1695,12 +1697,21 @@
             </w:tcMar>
           </w:tcPr>
           <w:p>
-            <w:r>
-              <w:rPr>
-                <w:sz w:val="20"/>
-                <w:szCs w:val="20"/>
-              </w:rPr>
-              <w:t>VARCHAR(60)</w:t>
+            <w:proofErr w:type="gramStart"/>
+            <w:r>
+              <w:rPr>
+                <w:sz w:val="20"/>
+                <w:szCs w:val="20"/>
+              </w:rPr>
+              <w:t>VARCHAR(</w:t>
+            </w:r>
+            <w:proofErr w:type="gramEnd"/>
+            <w:r>
+              <w:rPr>
+                <w:sz w:val="20"/>
+                <w:szCs w:val="20"/>
+              </w:rPr>
+              <w:t>60)</w:t>
             </w:r>
           </w:p>
         </w:tc>
@@ -1797,12 +1808,21 @@
             </w:tcMar>
           </w:tcPr>
           <w:p>
-            <w:r>
-              <w:rPr>
-                <w:sz w:val="20"/>
-                <w:szCs w:val="20"/>
-              </w:rPr>
-              <w:t>VARCHAR(80)</w:t>
+            <w:proofErr w:type="gramStart"/>
+            <w:r>
+              <w:rPr>
+                <w:sz w:val="20"/>
+                <w:szCs w:val="20"/>
+              </w:rPr>
+              <w:t>VARCHAR(</w:t>
+            </w:r>
+            <w:proofErr w:type="gramEnd"/>
+            <w:r>
+              <w:rPr>
+                <w:sz w:val="20"/>
+                <w:szCs w:val="20"/>
+              </w:rPr>
+              <w:t>80)</w:t>
             </w:r>
           </w:p>
         </w:tc>
@@ -1872,6 +1892,7 @@
             </w:tcMar>
           </w:tcPr>
           <w:p>
+            <w:proofErr w:type="spellStart"/>
             <w:r>
               <w:rPr>
                 <w:sz w:val="20"/>
@@ -1879,6 +1900,7 @@
               </w:rPr>
               <w:t>anio_lanzamiento</w:t>
             </w:r>
+            <w:proofErr w:type="spellEnd"/>
           </w:p>
         </w:tc>
         <w:tc>
@@ -1997,10 +2019,15 @@
         <w:spacing w:before="60" w:after="80"/>
       </w:pPr>
       <w:r>
-        <w:t xml:space="preserve">Tabla principal del catálogo. Cada videojuego pertenece a un único género (la columna id_genero se usará como clave foránea en la Sección </w:t>
-      </w:r>
-      <w:r>
-        <w:t>3).</w:t>
+        <w:t xml:space="preserve">Tabla principal del catálogo. Cada videojuego pertenece a un único género (la columna </w:t>
+      </w:r>
+      <w:proofErr w:type="spellStart"/>
+      <w:r>
+        <w:t>id_genero</w:t>
+      </w:r>
+      <w:proofErr w:type="spellEnd"/>
+      <w:r>
+        <w:t xml:space="preserve"> se usará como clave foránea en la Sección 3).</w:t>
       </w:r>
     </w:p>
     <w:p>
@@ -2187,6 +2214,7 @@
             </w:tcMar>
           </w:tcPr>
           <w:p>
+            <w:proofErr w:type="spellStart"/>
             <w:r>
               <w:rPr>
                 <w:sz w:val="20"/>
@@ -2194,6 +2222,7 @@
               </w:rPr>
               <w:t>id_juego</w:t>
             </w:r>
+            <w:proofErr w:type="spellEnd"/>
           </w:p>
         </w:tc>
         <w:tc>
@@ -2324,12 +2353,21 @@
             </w:tcMar>
           </w:tcPr>
           <w:p>
-            <w:r>
-              <w:rPr>
-                <w:sz w:val="20"/>
-                <w:szCs w:val="20"/>
-              </w:rPr>
-              <w:t>VARCHAR(120)</w:t>
+            <w:proofErr w:type="gramStart"/>
+            <w:r>
+              <w:rPr>
+                <w:sz w:val="20"/>
+                <w:szCs w:val="20"/>
+              </w:rPr>
+              <w:t>VARCHAR(</w:t>
+            </w:r>
+            <w:proofErr w:type="gramEnd"/>
+            <w:r>
+              <w:rPr>
+                <w:sz w:val="20"/>
+                <w:szCs w:val="20"/>
+              </w:rPr>
+              <w:t>120)</w:t>
             </w:r>
           </w:p>
         </w:tc>
@@ -2434,12 +2472,21 @@
             </w:tcMar>
           </w:tcPr>
           <w:p>
-            <w:r>
-              <w:rPr>
-                <w:sz w:val="20"/>
-                <w:szCs w:val="20"/>
-              </w:rPr>
-              <w:t>VARCHAR(100)</w:t>
+            <w:proofErr w:type="gramStart"/>
+            <w:r>
+              <w:rPr>
+                <w:sz w:val="20"/>
+                <w:szCs w:val="20"/>
+              </w:rPr>
+              <w:t>VARCHAR(</w:t>
+            </w:r>
+            <w:proofErr w:type="gramEnd"/>
+            <w:r>
+              <w:rPr>
+                <w:sz w:val="20"/>
+                <w:szCs w:val="20"/>
+              </w:rPr>
+              <w:t>100)</w:t>
             </w:r>
           </w:p>
         </w:tc>
@@ -2517,6 +2564,7 @@
             </w:tcMar>
           </w:tcPr>
           <w:p>
+            <w:proofErr w:type="spellStart"/>
             <w:r>
               <w:rPr>
                 <w:sz w:val="20"/>
@@ -2524,6 +2572,7 @@
               </w:rPr>
               <w:t>anio_lanzamiento</w:t>
             </w:r>
+            <w:proofErr w:type="spellEnd"/>
           </w:p>
         </w:tc>
         <w:tc>
@@ -2576,14 +2625,7 @@
                 <w:sz w:val="20"/>
                 <w:szCs w:val="20"/>
               </w:rPr>
-              <w:t xml:space="preserve">NOT </w:t>
-            </w:r>
-            <w:r>
-              <w:rPr>
-                <w:sz w:val="20"/>
-                <w:szCs w:val="20"/>
-              </w:rPr>
-              <w:t>NULL</w:t>
+              <w:t>NOT NULL</w:t>
             </w:r>
           </w:p>
         </w:tc>
@@ -2661,12 +2703,21 @@
             </w:tcMar>
           </w:tcPr>
           <w:p>
-            <w:r>
-              <w:rPr>
-                <w:sz w:val="20"/>
-                <w:szCs w:val="20"/>
-              </w:rPr>
-              <w:t>DECIMAL(6,2)</w:t>
+            <w:proofErr w:type="gramStart"/>
+            <w:r>
+              <w:rPr>
+                <w:sz w:val="20"/>
+                <w:szCs w:val="20"/>
+              </w:rPr>
+              <w:t>DECIMAL(</w:t>
+            </w:r>
+            <w:proofErr w:type="gramEnd"/>
+            <w:r>
+              <w:rPr>
+                <w:sz w:val="20"/>
+                <w:szCs w:val="20"/>
+              </w:rPr>
+              <w:t>6,2)</w:t>
             </w:r>
           </w:p>
         </w:tc>
@@ -2744,6 +2795,7 @@
             </w:tcMar>
           </w:tcPr>
           <w:p>
+            <w:proofErr w:type="spellStart"/>
             <w:r>
               <w:rPr>
                 <w:sz w:val="20"/>
@@ -2751,6 +2803,7 @@
               </w:rPr>
               <w:t>id_genero</w:t>
             </w:r>
+            <w:proofErr w:type="spellEnd"/>
           </w:p>
         </w:tc>
         <w:tc>
@@ -2859,10 +2912,15 @@
         <w:spacing w:before="60" w:after="80"/>
       </w:pPr>
       <w:r>
-        <w:t xml:space="preserve">Tabla intermedia (pivote) que representa la relación many-to-many entre VIDEOJUEGO y </w:t>
-      </w:r>
-      <w:r>
-        <w:t>PLATAFORMA. La clave primaria es compuesta por los dos campos id. Las claves foráneas se agregarán en la Sección 3.</w:t>
+        <w:t xml:space="preserve">Tabla intermedia (pivote) que representa la relación </w:t>
+      </w:r>
+      <w:proofErr w:type="spellStart"/>
+      <w:r>
+        <w:t>many-to-many</w:t>
+      </w:r>
+      <w:proofErr w:type="spellEnd"/>
+      <w:r>
+        <w:t xml:space="preserve"> entre VIDEOJUEGO y PLATAFORMA. La clave primaria es compuesta por los dos campos id. Las claves foráneas se agregarán en la Sección 3.</w:t>
       </w:r>
     </w:p>
     <w:p>
@@ -3049,6 +3107,7 @@
             </w:tcMar>
           </w:tcPr>
           <w:p>
+            <w:proofErr w:type="spellStart"/>
             <w:r>
               <w:rPr>
                 <w:sz w:val="20"/>
@@ -3056,6 +3115,7 @@
               </w:rPr>
               <w:t>id_juego</w:t>
             </w:r>
+            <w:proofErr w:type="spellEnd"/>
           </w:p>
         </w:tc>
         <w:tc>
@@ -3159,6 +3219,7 @@
             </w:tcMar>
           </w:tcPr>
           <w:p>
+            <w:proofErr w:type="spellStart"/>
             <w:r>
               <w:rPr>
                 <w:sz w:val="20"/>
@@ -3166,6 +3227,7 @@
               </w:rPr>
               <w:t>id_plataforma</w:t>
             </w:r>
+            <w:proofErr w:type="spellEnd"/>
           </w:p>
         </w:tc>
         <w:tc>
@@ -3245,14 +3307,7 @@
                 <w:sz w:val="20"/>
                 <w:szCs w:val="20"/>
               </w:rPr>
-              <w:t xml:space="preserve">FK </w:t>
-            </w:r>
-            <w:r>
-              <w:rPr>
-                <w:sz w:val="20"/>
-                <w:szCs w:val="20"/>
-              </w:rPr>
-              <w:t>hacia PLATAFORMA (Sección 3)</w:t>
+              <w:t>FK hacia PLATAFORMA (Sección 3)</w:t>
             </w:r>
           </w:p>
         </w:tc>
@@ -3276,6 +3331,7 @@
             </w:tcMar>
           </w:tcPr>
           <w:p>
+            <w:proofErr w:type="spellStart"/>
             <w:r>
               <w:rPr>
                 <w:sz w:val="20"/>
@@ -3283,6 +3339,7 @@
               </w:rPr>
               <w:t>fecha_disponible</w:t>
             </w:r>
+            <w:proofErr w:type="spellEnd"/>
           </w:p>
         </w:tc>
         <w:tc>
@@ -3531,20 +3588,26 @@
         <w:t xml:space="preserve">. </w:t>
       </w:r>
       <w:r>
-        <w:t>Respeta el orden de inserción para no violar</w:t>
-      </w:r>
-      <w:r>
-        <w:t xml:space="preserve"> restricciones de integridad referencial.</w:t>
+        <w:t>Respeta el orden de inserción para no violar restricciones de integridad referencial.</w:t>
       </w:r>
       <w:r>
         <w:t xml:space="preserve"> La evidencia es un “</w:t>
       </w:r>
+      <w:proofErr w:type="spellStart"/>
       <w:r>
         <w:rPr>
           <w:i/>
           <w:iCs/>
         </w:rPr>
-        <w:t>screenshoot de los datos”</w:t>
+        <w:t>screenshoot</w:t>
+      </w:r>
+      <w:proofErr w:type="spellEnd"/>
+      <w:r>
+        <w:rPr>
+          <w:i/>
+          <w:iCs/>
+        </w:rPr>
+        <w:t xml:space="preserve"> de los datos”</w:t>
       </w:r>
     </w:p>
     <w:p>
@@ -3578,6 +3641,51 @@
     </w:p>
     <w:p>
       <w:pPr>
+        <w:spacing w:before="60" w:after="80"/>
+      </w:pPr>
+      <w:r>
+        <w:rPr>
+          <w:noProof/>
+        </w:rPr>
+        <w:drawing>
+          <wp:inline distT="0" distB="0" distL="0" distR="0" wp14:anchorId="5AC3B030" wp14:editId="7C4BE8DD">
+            <wp:extent cx="5089089" cy="2524125"/>
+            <wp:effectExtent l="0" t="0" r="0" b="0"/>
+            <wp:docPr id="1" name="Imagen 1"/>
+            <wp:cNvGraphicFramePr>
+              <a:graphicFrameLocks xmlns:a="http://schemas.openxmlformats.org/drawingml/2006/main" noChangeAspect="1"/>
+            </wp:cNvGraphicFramePr>
+            <a:graphic xmlns:a="http://schemas.openxmlformats.org/drawingml/2006/main">
+              <a:graphicData uri="http://schemas.openxmlformats.org/drawingml/2006/picture">
+                <pic:pic xmlns:pic="http://schemas.openxmlformats.org/drawingml/2006/picture">
+                  <pic:nvPicPr>
+                    <pic:cNvPr id="1" name=""/>
+                    <pic:cNvPicPr/>
+                  </pic:nvPicPr>
+                  <pic:blipFill>
+                    <a:blip r:embed="rId7"/>
+                    <a:stretch>
+                      <a:fillRect/>
+                    </a:stretch>
+                  </pic:blipFill>
+                  <pic:spPr>
+                    <a:xfrm>
+                      <a:off x="0" y="0"/>
+                      <a:ext cx="5119509" cy="2539213"/>
+                    </a:xfrm>
+                    <a:prstGeom prst="rect">
+                      <a:avLst/>
+                    </a:prstGeom>
+                  </pic:spPr>
+                </pic:pic>
+              </a:graphicData>
+            </a:graphic>
+          </wp:inline>
+        </w:drawing>
+      </w:r>
+    </w:p>
+    <w:p>
+      <w:pPr>
         <w:spacing w:before="60" w:after="60"/>
       </w:pPr>
     </w:p>
@@ -3607,6 +3715,51 @@
     </w:p>
     <w:p>
       <w:pPr>
+        <w:spacing w:before="60" w:after="80"/>
+      </w:pPr>
+      <w:r>
+        <w:rPr>
+          <w:noProof/>
+        </w:rPr>
+        <w:drawing>
+          <wp:inline distT="0" distB="0" distL="0" distR="0" wp14:anchorId="366709D8" wp14:editId="558A6B7E">
+            <wp:extent cx="5105400" cy="2614152"/>
+            <wp:effectExtent l="0" t="0" r="0" b="0"/>
+            <wp:docPr id="2" name="Imagen 2"/>
+            <wp:cNvGraphicFramePr>
+              <a:graphicFrameLocks xmlns:a="http://schemas.openxmlformats.org/drawingml/2006/main" noChangeAspect="1"/>
+            </wp:cNvGraphicFramePr>
+            <a:graphic xmlns:a="http://schemas.openxmlformats.org/drawingml/2006/main">
+              <a:graphicData uri="http://schemas.openxmlformats.org/drawingml/2006/picture">
+                <pic:pic xmlns:pic="http://schemas.openxmlformats.org/drawingml/2006/picture">
+                  <pic:nvPicPr>
+                    <pic:cNvPr id="1" name=""/>
+                    <pic:cNvPicPr/>
+                  </pic:nvPicPr>
+                  <pic:blipFill>
+                    <a:blip r:embed="rId8"/>
+                    <a:stretch>
+                      <a:fillRect/>
+                    </a:stretch>
+                  </pic:blipFill>
+                  <pic:spPr>
+                    <a:xfrm>
+                      <a:off x="0" y="0"/>
+                      <a:ext cx="5188726" cy="2656818"/>
+                    </a:xfrm>
+                    <a:prstGeom prst="rect">
+                      <a:avLst/>
+                    </a:prstGeom>
+                  </pic:spPr>
+                </pic:pic>
+              </a:graphicData>
+            </a:graphic>
+          </wp:inline>
+        </w:drawing>
+      </w:r>
+    </w:p>
+    <w:p>
+      <w:pPr>
         <w:spacing w:before="60" w:after="60"/>
       </w:pPr>
     </w:p>
@@ -3636,6 +3789,51 @@
     </w:p>
     <w:p>
       <w:pPr>
+        <w:spacing w:before="60" w:after="80"/>
+      </w:pPr>
+      <w:r>
+        <w:rPr>
+          <w:noProof/>
+        </w:rPr>
+        <w:drawing>
+          <wp:inline distT="0" distB="0" distL="0" distR="0" wp14:anchorId="320E4196" wp14:editId="29A0F1C4">
+            <wp:extent cx="6172200" cy="3315970"/>
+            <wp:effectExtent l="0" t="0" r="0" b="0"/>
+            <wp:docPr id="4" name="Imagen 4"/>
+            <wp:cNvGraphicFramePr>
+              <a:graphicFrameLocks xmlns:a="http://schemas.openxmlformats.org/drawingml/2006/main" noChangeAspect="1"/>
+            </wp:cNvGraphicFramePr>
+            <a:graphic xmlns:a="http://schemas.openxmlformats.org/drawingml/2006/main">
+              <a:graphicData uri="http://schemas.openxmlformats.org/drawingml/2006/picture">
+                <pic:pic xmlns:pic="http://schemas.openxmlformats.org/drawingml/2006/picture">
+                  <pic:nvPicPr>
+                    <pic:cNvPr id="1" name=""/>
+                    <pic:cNvPicPr/>
+                  </pic:nvPicPr>
+                  <pic:blipFill>
+                    <a:blip r:embed="rId9"/>
+                    <a:stretch>
+                      <a:fillRect/>
+                    </a:stretch>
+                  </pic:blipFill>
+                  <pic:spPr>
+                    <a:xfrm>
+                      <a:off x="0" y="0"/>
+                      <a:ext cx="6172200" cy="3315970"/>
+                    </a:xfrm>
+                    <a:prstGeom prst="rect">
+                      <a:avLst/>
+                    </a:prstGeom>
+                  </pic:spPr>
+                </pic:pic>
+              </a:graphicData>
+            </a:graphic>
+          </wp:inline>
+        </w:drawing>
+      </w:r>
+    </w:p>
+    <w:p>
+      <w:pPr>
         <w:spacing w:before="60" w:after="60"/>
       </w:pPr>
     </w:p>
@@ -3649,15 +3847,7 @@
           <w:bCs/>
           <w:color w:val="2E6DA4"/>
         </w:rPr>
-        <w:t xml:space="preserve">VIDEOJUEGO_PLATAFORMA — </w:t>
-      </w:r>
-      <w:r>
-        <w:rPr>
-          <w:b/>
-          <w:bCs/>
-          <w:color w:val="2E6DA4"/>
-        </w:rPr>
-        <w:t>10 registros</w:t>
+        <w:t>VIDEOJUEGO_PLATAFORMA — 10 registros</w:t>
       </w:r>
     </w:p>
     <w:p>
@@ -3673,14 +3863,52 @@
     </w:p>
     <w:p>
       <w:pPr>
+        <w:spacing w:before="60" w:after="80"/>
+      </w:pPr>
+      <w:r>
+        <w:drawing>
+          <wp:inline distT="0" distB="0" distL="0" distR="0" wp14:anchorId="5411D19F" wp14:editId="6B9FE971">
+            <wp:extent cx="4496534" cy="3419475"/>
+            <wp:effectExtent l="0" t="0" r="0" b="0"/>
+            <wp:docPr id="12" name="Imagen 12"/>
+            <wp:cNvGraphicFramePr>
+              <a:graphicFrameLocks xmlns:a="http://schemas.openxmlformats.org/drawingml/2006/main" noChangeAspect="1"/>
+            </wp:cNvGraphicFramePr>
+            <a:graphic xmlns:a="http://schemas.openxmlformats.org/drawingml/2006/main">
+              <a:graphicData uri="http://schemas.openxmlformats.org/drawingml/2006/picture">
+                <pic:pic xmlns:pic="http://schemas.openxmlformats.org/drawingml/2006/picture">
+                  <pic:nvPicPr>
+                    <pic:cNvPr id="1" name=""/>
+                    <pic:cNvPicPr/>
+                  </pic:nvPicPr>
+                  <pic:blipFill>
+                    <a:blip r:embed="rId10"/>
+                    <a:stretch>
+                      <a:fillRect/>
+                    </a:stretch>
+                  </pic:blipFill>
+                  <pic:spPr>
+                    <a:xfrm>
+                      <a:off x="0" y="0"/>
+                      <a:ext cx="4501737" cy="3423432"/>
+                    </a:xfrm>
+                    <a:prstGeom prst="rect">
+                      <a:avLst/>
+                    </a:prstGeom>
+                  </pic:spPr>
+                </pic:pic>
+              </a:graphicData>
+            </a:graphic>
+          </wp:inline>
+        </w:drawing>
+      </w:r>
+    </w:p>
+    <w:p>
+      <w:pPr>
         <w:spacing w:before="60" w:after="60"/>
       </w:pPr>
     </w:p>
-    <w:p>
-      <w:r>
-        <w:br w:type="page"/>
-      </w:r>
-    </w:p>
+    <w:p/>
     <w:tbl>
       <w:tblPr>
         <w:tblW w:w="9360" w:type="dxa"/>
@@ -3729,7 +3957,6 @@
                 <w:sz w:val="24"/>
                 <w:szCs w:val="24"/>
               </w:rPr>
-              <w:lastRenderedPageBreak/>
               <w:t>SECCIÓN 3 — Creación de Relaciones</w:t>
             </w:r>
           </w:p>
@@ -3794,10 +4021,7 @@
         <w:spacing w:before="60" w:after="80"/>
       </w:pPr>
       <w:r>
-        <w:t xml:space="preserve">Agrega las claves foráneas (FOREIGN KEY) que relacionan las tablas creadas en la Sección 1. Debes implementar exactamente las dos relaciones indicadas a </w:t>
-      </w:r>
-      <w:r>
-        <w:t>continuación.</w:t>
+        <w:t>Agrega las claves foráneas (FOREIGN KEY) que relacionan las tablas creadas en la Sección 1. Debes implementar exactamente las dos relaciones indicadas a continuación.</w:t>
       </w:r>
     </w:p>
     <w:p>
@@ -3810,7 +4034,43 @@
           <w:bCs/>
           <w:color w:val="2E6DA4"/>
         </w:rPr>
-        <w:t>Relación 1 — One-to-Many  (GENERO → VIDEOJUEGO)</w:t>
+        <w:t xml:space="preserve">Relación 1 — </w:t>
+      </w:r>
+      <w:proofErr w:type="spellStart"/>
+      <w:r>
+        <w:rPr>
+          <w:b/>
+          <w:bCs/>
+          <w:color w:val="2E6DA4"/>
+        </w:rPr>
+        <w:t>One-to-</w:t>
+      </w:r>
+      <w:proofErr w:type="gramStart"/>
+      <w:r>
+        <w:rPr>
+          <w:b/>
+          <w:bCs/>
+          <w:color w:val="2E6DA4"/>
+        </w:rPr>
+        <w:t>Many</w:t>
+      </w:r>
+      <w:proofErr w:type="spellEnd"/>
+      <w:r>
+        <w:rPr>
+          <w:b/>
+          <w:bCs/>
+          <w:color w:val="2E6DA4"/>
+        </w:rPr>
+        <w:t xml:space="preserve">  (</w:t>
+      </w:r>
+      <w:proofErr w:type="gramEnd"/>
+      <w:r>
+        <w:rPr>
+          <w:b/>
+          <w:bCs/>
+          <w:color w:val="2E6DA4"/>
+        </w:rPr>
+        <w:t>GENERO → VIDEOJUEGO)</w:t>
       </w:r>
     </w:p>
     <w:p>
@@ -3998,12 +4258,30 @@
             </w:tcMar>
           </w:tcPr>
           <w:p>
-            <w:r>
-              <w:rPr>
-                <w:sz w:val="20"/>
-                <w:szCs w:val="20"/>
-              </w:rPr>
-              <w:t>VIDEOJUEGO  (id_genero)</w:t>
+            <w:proofErr w:type="gramStart"/>
+            <w:r>
+              <w:rPr>
+                <w:sz w:val="20"/>
+                <w:szCs w:val="20"/>
+              </w:rPr>
+              <w:t>VIDEOJUEGO  (</w:t>
+            </w:r>
+            <w:proofErr w:type="spellStart"/>
+            <w:proofErr w:type="gramEnd"/>
+            <w:r>
+              <w:rPr>
+                <w:sz w:val="20"/>
+                <w:szCs w:val="20"/>
+              </w:rPr>
+              <w:t>id_genero</w:t>
+            </w:r>
+            <w:proofErr w:type="spellEnd"/>
+            <w:r>
+              <w:rPr>
+                <w:sz w:val="20"/>
+                <w:szCs w:val="20"/>
+              </w:rPr>
+              <w:t>)</w:t>
             </w:r>
           </w:p>
         </w:tc>
@@ -4108,12 +4386,30 @@
             </w:tcMar>
           </w:tcPr>
           <w:p>
-            <w:r>
-              <w:rPr>
-                <w:sz w:val="20"/>
-                <w:szCs w:val="20"/>
-              </w:rPr>
-              <w:t>GENERO  (id_genero)</w:t>
+            <w:proofErr w:type="gramStart"/>
+            <w:r>
+              <w:rPr>
+                <w:sz w:val="20"/>
+                <w:szCs w:val="20"/>
+              </w:rPr>
+              <w:t>GENERO  (</w:t>
+            </w:r>
+            <w:proofErr w:type="spellStart"/>
+            <w:proofErr w:type="gramEnd"/>
+            <w:r>
+              <w:rPr>
+                <w:sz w:val="20"/>
+                <w:szCs w:val="20"/>
+              </w:rPr>
+              <w:t>id_genero</w:t>
+            </w:r>
+            <w:proofErr w:type="spellEnd"/>
+            <w:r>
+              <w:rPr>
+                <w:sz w:val="20"/>
+                <w:szCs w:val="20"/>
+              </w:rPr>
+              <w:t>)</w:t>
             </w:r>
           </w:p>
         </w:tc>
@@ -4128,6 +4424,51 @@
           <w:highlight w:val="yellow"/>
         </w:rPr>
         <w:t>PONER EVIDENCIA RELACION 1</w:t>
+      </w:r>
+    </w:p>
+    <w:p>
+      <w:pPr>
+        <w:spacing w:before="60" w:after="60"/>
+      </w:pPr>
+      <w:r>
+        <w:rPr>
+          <w:noProof/>
+        </w:rPr>
+        <w:drawing>
+          <wp:inline distT="0" distB="0" distL="0" distR="0" wp14:anchorId="29EF1CFB" wp14:editId="2FA68CE0">
+            <wp:extent cx="6172200" cy="1113155"/>
+            <wp:effectExtent l="0" t="0" r="0" b="0"/>
+            <wp:docPr id="6" name="Imagen 6"/>
+            <wp:cNvGraphicFramePr>
+              <a:graphicFrameLocks xmlns:a="http://schemas.openxmlformats.org/drawingml/2006/main" noChangeAspect="1"/>
+            </wp:cNvGraphicFramePr>
+            <a:graphic xmlns:a="http://schemas.openxmlformats.org/drawingml/2006/main">
+              <a:graphicData uri="http://schemas.openxmlformats.org/drawingml/2006/picture">
+                <pic:pic xmlns:pic="http://schemas.openxmlformats.org/drawingml/2006/picture">
+                  <pic:nvPicPr>
+                    <pic:cNvPr id="1" name=""/>
+                    <pic:cNvPicPr/>
+                  </pic:nvPicPr>
+                  <pic:blipFill>
+                    <a:blip r:embed="rId11"/>
+                    <a:stretch>
+                      <a:fillRect/>
+                    </a:stretch>
+                  </pic:blipFill>
+                  <pic:spPr>
+                    <a:xfrm>
+                      <a:off x="0" y="0"/>
+                      <a:ext cx="6172200" cy="1113155"/>
+                    </a:xfrm>
+                    <a:prstGeom prst="rect">
+                      <a:avLst/>
+                    </a:prstGeom>
+                  </pic:spPr>
+                </pic:pic>
+              </a:graphicData>
+            </a:graphic>
+          </wp:inline>
+        </w:drawing>
       </w:r>
     </w:p>
     <w:p>
@@ -4140,7 +4481,43 @@
           <w:bCs/>
           <w:color w:val="2E6DA4"/>
         </w:rPr>
-        <w:t>Relación 2 — Many-to-Many  (VIDEOJUEGO ↔ PLATAFORMA)</w:t>
+        <w:t xml:space="preserve">Relación 2 — </w:t>
+      </w:r>
+      <w:proofErr w:type="spellStart"/>
+      <w:r>
+        <w:rPr>
+          <w:b/>
+          <w:bCs/>
+          <w:color w:val="2E6DA4"/>
+        </w:rPr>
+        <w:t>Many-to-</w:t>
+      </w:r>
+      <w:proofErr w:type="gramStart"/>
+      <w:r>
+        <w:rPr>
+          <w:b/>
+          <w:bCs/>
+          <w:color w:val="2E6DA4"/>
+        </w:rPr>
+        <w:t>Many</w:t>
+      </w:r>
+      <w:proofErr w:type="spellEnd"/>
+      <w:r>
+        <w:rPr>
+          <w:b/>
+          <w:bCs/>
+          <w:color w:val="2E6DA4"/>
+        </w:rPr>
+        <w:t xml:space="preserve">  (</w:t>
+      </w:r>
+      <w:proofErr w:type="gramEnd"/>
+      <w:r>
+        <w:rPr>
+          <w:b/>
+          <w:bCs/>
+          <w:color w:val="2E6DA4"/>
+        </w:rPr>
+        <w:t>VIDEOJUEGO ↔ PLATAFORMA)</w:t>
       </w:r>
     </w:p>
     <w:p>
@@ -4148,10 +4525,7 @@
         <w:spacing w:before="60" w:after="80"/>
       </w:pPr>
       <w:r>
-        <w:t xml:space="preserve">Un videojuego puede estar en muchas plataformas y una plataforma puede tener muchos videojuegos. Esta relación se implementa a través de la </w:t>
-      </w:r>
-      <w:r>
-        <w:t>tabla pivote VIDEOJUEGO_PLATAFORMA, por lo que debes crear dos claves foráneas:</w:t>
+        <w:t>Un videojuego puede estar en muchas plataformas y una plataforma puede tener muchos videojuegos. Esta relación se implementa a través de la tabla pivote VIDEOJUEGO_PLATAFORMA, por lo que debes crear dos claves foráneas:</w:t>
       </w:r>
     </w:p>
     <w:p>
@@ -4348,7 +4722,32 @@
                 <w:sz w:val="20"/>
                 <w:szCs w:val="20"/>
               </w:rPr>
-              <w:t>VIDEOJUEGO_PLATAFORMA  (id_juego)</w:t>
+              <w:t>VIDEOJUEGO_</w:t>
+            </w:r>
+            <w:proofErr w:type="gramStart"/>
+            <w:r>
+              <w:rPr>
+                <w:sz w:val="20"/>
+                <w:szCs w:val="20"/>
+              </w:rPr>
+              <w:t>PLATAFORMA  (</w:t>
+            </w:r>
+            <w:proofErr w:type="spellStart"/>
+            <w:proofErr w:type="gramEnd"/>
+            <w:r>
+              <w:rPr>
+                <w:sz w:val="20"/>
+                <w:szCs w:val="20"/>
+              </w:rPr>
+              <w:t>id_juego</w:t>
+            </w:r>
+            <w:proofErr w:type="spellEnd"/>
+            <w:r>
+              <w:rPr>
+                <w:sz w:val="20"/>
+                <w:szCs w:val="20"/>
+              </w:rPr>
+              <w:t>)</w:t>
             </w:r>
           </w:p>
         </w:tc>
@@ -4453,12 +4852,30 @@
             </w:tcMar>
           </w:tcPr>
           <w:p>
-            <w:r>
-              <w:rPr>
-                <w:sz w:val="20"/>
-                <w:szCs w:val="20"/>
-              </w:rPr>
-              <w:t>VIDEOJUEGO  (id_juego)</w:t>
+            <w:proofErr w:type="gramStart"/>
+            <w:r>
+              <w:rPr>
+                <w:sz w:val="20"/>
+                <w:szCs w:val="20"/>
+              </w:rPr>
+              <w:t>VIDEOJUEGO  (</w:t>
+            </w:r>
+            <w:proofErr w:type="spellStart"/>
+            <w:proofErr w:type="gramEnd"/>
+            <w:r>
+              <w:rPr>
+                <w:sz w:val="20"/>
+                <w:szCs w:val="20"/>
+              </w:rPr>
+              <w:t>id_juego</w:t>
+            </w:r>
+            <w:proofErr w:type="spellEnd"/>
+            <w:r>
+              <w:rPr>
+                <w:sz w:val="20"/>
+                <w:szCs w:val="20"/>
+              </w:rPr>
+              <w:t>)</w:t>
             </w:r>
           </w:p>
         </w:tc>
@@ -4658,7 +5075,32 @@
                 <w:sz w:val="20"/>
                 <w:szCs w:val="20"/>
               </w:rPr>
-              <w:t>VIDEOJUEGO_PLATAFORMA  (id_plataforma)</w:t>
+              <w:t>VIDEOJUEGO_</w:t>
+            </w:r>
+            <w:proofErr w:type="gramStart"/>
+            <w:r>
+              <w:rPr>
+                <w:sz w:val="20"/>
+                <w:szCs w:val="20"/>
+              </w:rPr>
+              <w:t>PLATAFORMA  (</w:t>
+            </w:r>
+            <w:proofErr w:type="spellStart"/>
+            <w:proofErr w:type="gramEnd"/>
+            <w:r>
+              <w:rPr>
+                <w:sz w:val="20"/>
+                <w:szCs w:val="20"/>
+              </w:rPr>
+              <w:t>id_plataforma</w:t>
+            </w:r>
+            <w:proofErr w:type="spellEnd"/>
+            <w:r>
+              <w:rPr>
+                <w:sz w:val="20"/>
+                <w:szCs w:val="20"/>
+              </w:rPr>
+              <w:t>)</w:t>
             </w:r>
           </w:p>
         </w:tc>
@@ -4763,12 +5205,30 @@
             </w:tcMar>
           </w:tcPr>
           <w:p>
-            <w:r>
-              <w:rPr>
-                <w:sz w:val="20"/>
-                <w:szCs w:val="20"/>
-              </w:rPr>
-              <w:t>PLATAFORMA  (id_plataforma)</w:t>
+            <w:proofErr w:type="gramStart"/>
+            <w:r>
+              <w:rPr>
+                <w:sz w:val="20"/>
+                <w:szCs w:val="20"/>
+              </w:rPr>
+              <w:t>PLATAFORMA  (</w:t>
+            </w:r>
+            <w:proofErr w:type="spellStart"/>
+            <w:proofErr w:type="gramEnd"/>
+            <w:r>
+              <w:rPr>
+                <w:sz w:val="20"/>
+                <w:szCs w:val="20"/>
+              </w:rPr>
+              <w:t>id_plataforma</w:t>
+            </w:r>
+            <w:proofErr w:type="spellEnd"/>
+            <w:r>
+              <w:rPr>
+                <w:sz w:val="20"/>
+                <w:szCs w:val="20"/>
+              </w:rPr>
+              <w:t>)</w:t>
             </w:r>
           </w:p>
         </w:tc>
@@ -4787,15 +5247,67 @@
         <w:rPr>
           <w:highlight w:val="yellow"/>
         </w:rPr>
+        <w:lastRenderedPageBreak/>
         <w:t xml:space="preserve">PONER EVIDENCIA RELACION </w:t>
       </w:r>
       <w:r>
         <w:t>2</w:t>
       </w:r>
     </w:p>
+    <w:p>
+      <w:pPr>
+        <w:spacing w:before="60" w:after="60"/>
+      </w:pPr>
+    </w:p>
+    <w:p>
+      <w:pPr>
+        <w:spacing w:before="60" w:after="60"/>
+      </w:pPr>
+      <w:r>
+        <w:rPr>
+          <w:noProof/>
+        </w:rPr>
+        <w:drawing>
+          <wp:inline distT="0" distB="0" distL="0" distR="0" wp14:anchorId="4BA13B6B" wp14:editId="3ADB41CC">
+            <wp:extent cx="6172200" cy="1374775"/>
+            <wp:effectExtent l="0" t="0" r="0" b="0"/>
+            <wp:docPr id="7" name="Imagen 7"/>
+            <wp:cNvGraphicFramePr>
+              <a:graphicFrameLocks xmlns:a="http://schemas.openxmlformats.org/drawingml/2006/main" noChangeAspect="1"/>
+            </wp:cNvGraphicFramePr>
+            <a:graphic xmlns:a="http://schemas.openxmlformats.org/drawingml/2006/main">
+              <a:graphicData uri="http://schemas.openxmlformats.org/drawingml/2006/picture">
+                <pic:pic xmlns:pic="http://schemas.openxmlformats.org/drawingml/2006/picture">
+                  <pic:nvPicPr>
+                    <pic:cNvPr id="1" name=""/>
+                    <pic:cNvPicPr/>
+                  </pic:nvPicPr>
+                  <pic:blipFill>
+                    <a:blip r:embed="rId12"/>
+                    <a:stretch>
+                      <a:fillRect/>
+                    </a:stretch>
+                  </pic:blipFill>
+                  <pic:spPr>
+                    <a:xfrm>
+                      <a:off x="0" y="0"/>
+                      <a:ext cx="6172200" cy="1374775"/>
+                    </a:xfrm>
+                    <a:prstGeom prst="rect">
+                      <a:avLst/>
+                    </a:prstGeom>
+                  </pic:spPr>
+                </pic:pic>
+              </a:graphicData>
+            </a:graphic>
+          </wp:inline>
+        </w:drawing>
+      </w:r>
+    </w:p>
     <w:p/>
     <w:p>
       <w:pPr>
+        <w:jc w:val="center"/>
         <w:rPr>
           <w:b/>
           <w:bCs/>
@@ -4812,28 +5324,6 @@
           <w:szCs w:val="36"/>
           <w:highlight w:val="yellow"/>
         </w:rPr>
-        <w:br w:type="page"/>
-      </w:r>
-    </w:p>
-    <w:p>
-      <w:pPr>
-        <w:jc w:val="center"/>
-        <w:rPr>
-          <w:b/>
-          <w:bCs/>
-          <w:sz w:val="48"/>
-          <w:szCs w:val="48"/>
-        </w:rPr>
-      </w:pPr>
-      <w:r>
-        <w:rPr>
-          <w:b/>
-          <w:bCs/>
-          <w:sz w:val="36"/>
-          <w:szCs w:val="36"/>
-          <w:highlight w:val="yellow"/>
-        </w:rPr>
-        <w:lastRenderedPageBreak/>
         <w:t>PONER EVIDENCIA DEL DISEÑADOR</w:t>
       </w:r>
       <w:r>
@@ -4845,6 +5335,61 @@
           <w:highlight w:val="yellow"/>
         </w:rPr>
         <w:t>, CON RELACIONES</w:t>
+      </w:r>
+    </w:p>
+    <w:p>
+      <w:pPr>
+        <w:rPr>
+          <w:b/>
+          <w:bCs/>
+          <w:sz w:val="36"/>
+          <w:szCs w:val="36"/>
+          <w:highlight w:val="yellow"/>
+        </w:rPr>
+      </w:pPr>
+      <w:r>
+        <w:rPr>
+          <w:b/>
+          <w:bCs/>
+          <w:noProof/>
+          <w:sz w:val="36"/>
+          <w:szCs w:val="36"/>
+        </w:rPr>
+        <w:drawing>
+          <wp:inline distT="0" distB="0" distL="0" distR="0" wp14:anchorId="75C3B4ED" wp14:editId="5E6958F7">
+            <wp:extent cx="6172200" cy="3550920"/>
+            <wp:effectExtent l="0" t="0" r="0" b="0"/>
+            <wp:docPr id="8" name="Imagen 8"/>
+            <wp:cNvGraphicFramePr>
+              <a:graphicFrameLocks xmlns:a="http://schemas.openxmlformats.org/drawingml/2006/main" noChangeAspect="1"/>
+            </wp:cNvGraphicFramePr>
+            <a:graphic xmlns:a="http://schemas.openxmlformats.org/drawingml/2006/main">
+              <a:graphicData uri="http://schemas.openxmlformats.org/drawingml/2006/picture">
+                <pic:pic xmlns:pic="http://schemas.openxmlformats.org/drawingml/2006/picture">
+                  <pic:nvPicPr>
+                    <pic:cNvPr id="1" name=""/>
+                    <pic:cNvPicPr/>
+                  </pic:nvPicPr>
+                  <pic:blipFill>
+                    <a:blip r:embed="rId13"/>
+                    <a:stretch>
+                      <a:fillRect/>
+                    </a:stretch>
+                  </pic:blipFill>
+                  <pic:spPr>
+                    <a:xfrm>
+                      <a:off x="0" y="0"/>
+                      <a:ext cx="6172200" cy="3550920"/>
+                    </a:xfrm>
+                    <a:prstGeom prst="rect">
+                      <a:avLst/>
+                    </a:prstGeom>
+                  </pic:spPr>
+                </pic:pic>
+              </a:graphicData>
+            </a:graphic>
+          </wp:inline>
+        </w:drawing>
       </w:r>
     </w:p>
     <w:p/>
@@ -4986,10 +5531,7 @@
         <w:spacing w:before="60" w:after="80"/>
       </w:pPr>
       <w:r>
-        <w:t xml:space="preserve">Escribe las 5 consultas indicadas. Cada consulta debe ejecutarse correctamente con los datos que insertaste en la Sección 2. Coloca </w:t>
-      </w:r>
-      <w:r>
-        <w:t>un comentario antes de cada una indicando su número y propósito.</w:t>
+        <w:t>Escribe las 5 consultas indicadas. Cada consulta debe ejecutarse correctamente con los datos que insertaste en la Sección 2. Coloca un comentario antes de cada una indicando su número y propósito.</w:t>
       </w:r>
     </w:p>
     <w:p>
@@ -5007,8 +5549,18 @@
           <w:bCs/>
           <w:color w:val="2E6DA4"/>
         </w:rPr>
-        <w:t>Consulta 1 — Básica con WHERE y campos específicos  (</w:t>
-      </w:r>
+        <w:t xml:space="preserve">Consulta 1 — Básica con WHERE y campos </w:t>
+      </w:r>
+      <w:proofErr w:type="gramStart"/>
+      <w:r>
+        <w:rPr>
+          <w:b/>
+          <w:bCs/>
+          <w:color w:val="2E6DA4"/>
+        </w:rPr>
+        <w:t>específicos  (</w:t>
+      </w:r>
+      <w:proofErr w:type="gramEnd"/>
       <w:r>
         <w:rPr>
           <w:b/>
@@ -5023,7 +5575,25 @@
           <w:bCs/>
           <w:color w:val="2E6DA4"/>
         </w:rPr>
-        <w:t xml:space="preserve"> pts)</w:t>
+        <w:t xml:space="preserve"> </w:t>
+      </w:r>
+      <w:proofErr w:type="spellStart"/>
+      <w:r>
+        <w:rPr>
+          <w:b/>
+          <w:bCs/>
+          <w:color w:val="2E6DA4"/>
+        </w:rPr>
+        <w:t>pts</w:t>
+      </w:r>
+      <w:proofErr w:type="spellEnd"/>
+      <w:r>
+        <w:rPr>
+          <w:b/>
+          <w:bCs/>
+          <w:color w:val="2E6DA4"/>
+        </w:rPr>
+        <w:t>)</w:t>
       </w:r>
     </w:p>
     <w:p>
@@ -5031,10 +5601,7 @@
         <w:spacing w:before="60" w:after="80"/>
       </w:pPr>
       <w:r>
-        <w:t>Muestra el título, desarrolladora y precio de todos los videojuegos cuyo precio sea mayor a $50.00 USD. Ordena los resultados de m</w:t>
-      </w:r>
-      <w:r>
-        <w:t>ayor a menor precio.</w:t>
+        <w:t>Muestra el título, desarrolladora y precio de todos los videojuegos cuyo precio sea mayor a $50.00 USD. Ordena los resultados de mayor a menor precio.</w:t>
       </w:r>
     </w:p>
     <w:p>
@@ -5236,12 +5803,21 @@
             </w:tcMar>
           </w:tcPr>
           <w:p>
-            <w:r>
-              <w:rPr>
-                <w:sz w:val="20"/>
-                <w:szCs w:val="20"/>
-              </w:rPr>
-              <w:t>titulo, desarrolladora, precio</w:t>
+            <w:proofErr w:type="spellStart"/>
+            <w:r>
+              <w:rPr>
+                <w:sz w:val="20"/>
+                <w:szCs w:val="20"/>
+              </w:rPr>
+              <w:t>titulo</w:t>
+            </w:r>
+            <w:proofErr w:type="spellEnd"/>
+            <w:r>
+              <w:rPr>
+                <w:sz w:val="20"/>
+                <w:szCs w:val="20"/>
+              </w:rPr>
+              <w:t>, desarrolladora, precio</w:t>
             </w:r>
           </w:p>
         </w:tc>
@@ -5374,6 +5950,64 @@
         </w:rPr>
         <w:t>PONER EVIDENCIA CONSULTA 1</w:t>
       </w:r>
+    </w:p>
+    <w:p>
+      <w:pPr>
+        <w:spacing w:before="60" w:after="60"/>
+      </w:pPr>
+      <w:r>
+        <w:rPr>
+          <w:noProof/>
+        </w:rPr>
+        <w:drawing>
+          <wp:inline distT="0" distB="0" distL="0" distR="0" wp14:anchorId="1E47AC93" wp14:editId="0CA453A4">
+            <wp:extent cx="6172200" cy="3072765"/>
+            <wp:effectExtent l="0" t="0" r="0" b="0"/>
+            <wp:docPr id="9" name="Imagen 9"/>
+            <wp:cNvGraphicFramePr>
+              <a:graphicFrameLocks xmlns:a="http://schemas.openxmlformats.org/drawingml/2006/main" noChangeAspect="1"/>
+            </wp:cNvGraphicFramePr>
+            <a:graphic xmlns:a="http://schemas.openxmlformats.org/drawingml/2006/main">
+              <a:graphicData uri="http://schemas.openxmlformats.org/drawingml/2006/picture">
+                <pic:pic xmlns:pic="http://schemas.openxmlformats.org/drawingml/2006/picture">
+                  <pic:nvPicPr>
+                    <pic:cNvPr id="1" name=""/>
+                    <pic:cNvPicPr/>
+                  </pic:nvPicPr>
+                  <pic:blipFill>
+                    <a:blip r:embed="rId14"/>
+                    <a:stretch>
+                      <a:fillRect/>
+                    </a:stretch>
+                  </pic:blipFill>
+                  <pic:spPr>
+                    <a:xfrm>
+                      <a:off x="0" y="0"/>
+                      <a:ext cx="6172200" cy="3072765"/>
+                    </a:xfrm>
+                    <a:prstGeom prst="rect">
+                      <a:avLst/>
+                    </a:prstGeom>
+                  </pic:spPr>
+                </pic:pic>
+              </a:graphicData>
+            </a:graphic>
+          </wp:inline>
+        </w:drawing>
+      </w:r>
+    </w:p>
+    <w:p>
+      <w:pPr>
+        <w:spacing w:before="60" w:after="60"/>
+      </w:pPr>
+      <w:r>
+        <w:t>(No tenía los precios en dólares)</w:t>
+      </w:r>
+    </w:p>
+    <w:p>
+      <w:pPr>
+        <w:spacing w:before="60" w:after="60"/>
+      </w:pPr>
     </w:p>
     <w:p>
       <w:pPr>
@@ -5390,8 +6024,19 @@
           <w:bCs/>
           <w:color w:val="2E6DA4"/>
         </w:rPr>
-        <w:t>Consulta 2 — Básica con WHERE y operadores lógicos  (</w:t>
-      </w:r>
+        <w:lastRenderedPageBreak/>
+        <w:t xml:space="preserve">Consulta 2 — Básica con WHERE y operadores </w:t>
+      </w:r>
+      <w:proofErr w:type="gramStart"/>
+      <w:r>
+        <w:rPr>
+          <w:b/>
+          <w:bCs/>
+          <w:color w:val="2E6DA4"/>
+        </w:rPr>
+        <w:t>lógicos  (</w:t>
+      </w:r>
+      <w:proofErr w:type="gramEnd"/>
       <w:r>
         <w:rPr>
           <w:b/>
@@ -5400,13 +6045,23 @@
         </w:rPr>
         <w:t xml:space="preserve">8 </w:t>
       </w:r>
+      <w:proofErr w:type="spellStart"/>
       <w:r>
         <w:rPr>
           <w:b/>
           <w:bCs/>
           <w:color w:val="2E6DA4"/>
         </w:rPr>
-        <w:t>pts)</w:t>
+        <w:t>pts</w:t>
+      </w:r>
+      <w:proofErr w:type="spellEnd"/>
+      <w:r>
+        <w:rPr>
+          <w:b/>
+          <w:bCs/>
+          <w:color w:val="2E6DA4"/>
+        </w:rPr>
+        <w:t>)</w:t>
       </w:r>
     </w:p>
     <w:p>
@@ -5414,10 +6069,15 @@
         <w:spacing w:before="60" w:after="80"/>
       </w:pPr>
       <w:r>
-        <w:t xml:space="preserve">Lista el título, </w:t>
-      </w:r>
-      <w:r>
-        <w:t>desarrolladora y año de lanzamiento de todos los videojuegos que hayan sido lanzados entre 2021 y 2023 (ambos inclusive) O que pertenezcan a la desarrolladora 'CD Projekt Red'. Ordena por año de forma ascendente.</w:t>
+        <w:t xml:space="preserve">Lista el título, desarrolladora y año de lanzamiento de todos los videojuegos que hayan sido lanzados entre 2021 y 2023 (ambos inclusive) O que pertenezcan a la desarrolladora 'CD </w:t>
+      </w:r>
+      <w:proofErr w:type="spellStart"/>
+      <w:r>
+        <w:t>Projekt</w:t>
+      </w:r>
+      <w:proofErr w:type="spellEnd"/>
+      <w:r>
+        <w:t xml:space="preserve"> Red'. Ordena por año de forma ascendente.</w:t>
       </w:r>
     </w:p>
     <w:p>
@@ -5437,6 +6097,51 @@
       </w:r>
       <w:r>
         <w:t>2</w:t>
+      </w:r>
+    </w:p>
+    <w:p>
+      <w:pPr>
+        <w:spacing w:before="60" w:after="60"/>
+      </w:pPr>
+      <w:r>
+        <w:rPr>
+          <w:noProof/>
+        </w:rPr>
+        <w:drawing>
+          <wp:inline distT="0" distB="0" distL="0" distR="0" wp14:anchorId="04E216D6" wp14:editId="2C49D9BC">
+            <wp:extent cx="5248275" cy="1680852"/>
+            <wp:effectExtent l="0" t="0" r="0" b="0"/>
+            <wp:docPr id="10" name="Imagen 10"/>
+            <wp:cNvGraphicFramePr>
+              <a:graphicFrameLocks xmlns:a="http://schemas.openxmlformats.org/drawingml/2006/main" noChangeAspect="1"/>
+            </wp:cNvGraphicFramePr>
+            <a:graphic xmlns:a="http://schemas.openxmlformats.org/drawingml/2006/main">
+              <a:graphicData uri="http://schemas.openxmlformats.org/drawingml/2006/picture">
+                <pic:pic xmlns:pic="http://schemas.openxmlformats.org/drawingml/2006/picture">
+                  <pic:nvPicPr>
+                    <pic:cNvPr id="1" name=""/>
+                    <pic:cNvPicPr/>
+                  </pic:nvPicPr>
+                  <pic:blipFill>
+                    <a:blip r:embed="rId15"/>
+                    <a:stretch>
+                      <a:fillRect/>
+                    </a:stretch>
+                  </pic:blipFill>
+                  <pic:spPr>
+                    <a:xfrm>
+                      <a:off x="0" y="0"/>
+                      <a:ext cx="5281638" cy="1691537"/>
+                    </a:xfrm>
+                    <a:prstGeom prst="rect">
+                      <a:avLst/>
+                    </a:prstGeom>
+                  </pic:spPr>
+                </pic:pic>
+              </a:graphicData>
+            </a:graphic>
+          </wp:inline>
+        </w:drawing>
       </w:r>
     </w:p>
     <w:p>
@@ -5531,17 +6236,7 @@
                 <w:sz w:val="20"/>
                 <w:szCs w:val="20"/>
               </w:rPr>
-              <w:t>Deta</w:t>
-            </w:r>
-            <w:r>
-              <w:rPr>
-                <w:b/>
-                <w:bCs/>
-                <w:color w:val="FFFFFF"/>
-                <w:sz w:val="20"/>
-                <w:szCs w:val="20"/>
-              </w:rPr>
-              <w:t>lle</w:t>
+              <w:t>Detalle</w:t>
             </w:r>
           </w:p>
         </w:tc>
@@ -5648,13 +6343,31 @@
             </w:tcMar>
           </w:tcPr>
           <w:p>
-            <w:r>
-              <w:rPr>
-                <w:sz w:val="20"/>
-                <w:szCs w:val="20"/>
-              </w:rPr>
-              <w:t>titulo, desarrolladora, anio_lanzamiento</w:t>
-            </w:r>
+            <w:proofErr w:type="spellStart"/>
+            <w:r>
+              <w:rPr>
+                <w:sz w:val="20"/>
+                <w:szCs w:val="20"/>
+              </w:rPr>
+              <w:t>titulo</w:t>
+            </w:r>
+            <w:proofErr w:type="spellEnd"/>
+            <w:r>
+              <w:rPr>
+                <w:sz w:val="20"/>
+                <w:szCs w:val="20"/>
+              </w:rPr>
+              <w:t xml:space="preserve">, desarrolladora, </w:t>
+            </w:r>
+            <w:proofErr w:type="spellStart"/>
+            <w:r>
+              <w:rPr>
+                <w:sz w:val="20"/>
+                <w:szCs w:val="20"/>
+              </w:rPr>
+              <w:t>anio_lanzamiento</w:t>
+            </w:r>
+            <w:proofErr w:type="spellEnd"/>
           </w:p>
         </w:tc>
       </w:tr>
@@ -5715,7 +6428,61 @@
                 <w:szCs w:val="20"/>
                 <w:lang w:val="en-US"/>
               </w:rPr>
-              <w:t>BETWEEN 2021 AND 2023  OR  desarrolladora = 'CD Projekt Red'</w:t>
+              <w:t xml:space="preserve">BETWEEN 2021 AND </w:t>
+            </w:r>
+            <w:proofErr w:type="gramStart"/>
+            <w:r>
+              <w:rPr>
+                <w:sz w:val="20"/>
+                <w:szCs w:val="20"/>
+                <w:lang w:val="en-US"/>
+              </w:rPr>
+              <w:t>2023  OR</w:t>
+            </w:r>
+            <w:proofErr w:type="gramEnd"/>
+            <w:r>
+              <w:rPr>
+                <w:sz w:val="20"/>
+                <w:szCs w:val="20"/>
+                <w:lang w:val="en-US"/>
+              </w:rPr>
+              <w:t xml:space="preserve">  </w:t>
+            </w:r>
+            <w:proofErr w:type="spellStart"/>
+            <w:r>
+              <w:rPr>
+                <w:sz w:val="20"/>
+                <w:szCs w:val="20"/>
+                <w:lang w:val="en-US"/>
+              </w:rPr>
+              <w:t>desarrolladora</w:t>
+            </w:r>
+            <w:proofErr w:type="spellEnd"/>
+            <w:r>
+              <w:rPr>
+                <w:sz w:val="20"/>
+                <w:szCs w:val="20"/>
+                <w:lang w:val="en-US"/>
+              </w:rPr>
+              <w:t xml:space="preserve"> = 'CD </w:t>
+            </w:r>
+            <w:proofErr w:type="spellStart"/>
+            <w:r>
+              <w:rPr>
+                <w:sz w:val="20"/>
+                <w:szCs w:val="20"/>
+                <w:lang w:val="en-US"/>
+              </w:rPr>
+              <w:t>Projekt</w:t>
+            </w:r>
+            <w:proofErr w:type="spellEnd"/>
+            <w:r>
+              <w:rPr>
+                <w:sz w:val="20"/>
+                <w:szCs w:val="20"/>
+                <w:lang w:val="en-US"/>
+              </w:rPr>
+              <w:t xml:space="preserve"> Red'</w:t>
             </w:r>
           </w:p>
         </w:tc>
@@ -5766,12 +6533,21 @@
             </w:tcMar>
           </w:tcPr>
           <w:p>
-            <w:r>
-              <w:rPr>
-                <w:sz w:val="20"/>
-                <w:szCs w:val="20"/>
-              </w:rPr>
-              <w:t>anio_lanzamiento ASC</w:t>
+            <w:proofErr w:type="spellStart"/>
+            <w:r>
+              <w:rPr>
+                <w:sz w:val="20"/>
+                <w:szCs w:val="20"/>
+              </w:rPr>
+              <w:t>anio_lanzamiento</w:t>
+            </w:r>
+            <w:proofErr w:type="spellEnd"/>
+            <w:r>
+              <w:rPr>
+                <w:sz w:val="20"/>
+                <w:szCs w:val="20"/>
+              </w:rPr>
+              <w:t xml:space="preserve"> ASC</w:t>
             </w:r>
           </w:p>
         </w:tc>
@@ -5792,8 +6568,18 @@
           <w:bCs/>
           <w:color w:val="2E6DA4"/>
         </w:rPr>
-        <w:t>Consulta 3 — Básica con JOIN y WHERE  (</w:t>
-      </w:r>
+        <w:t xml:space="preserve">Consulta 3 — Básica con JOIN y </w:t>
+      </w:r>
+      <w:proofErr w:type="gramStart"/>
+      <w:r>
+        <w:rPr>
+          <w:b/>
+          <w:bCs/>
+          <w:color w:val="2E6DA4"/>
+        </w:rPr>
+        <w:t>WHERE  (</w:t>
+      </w:r>
+      <w:proofErr w:type="gramEnd"/>
       <w:r>
         <w:rPr>
           <w:b/>
@@ -5808,7 +6594,25 @@
           <w:bCs/>
           <w:color w:val="2E6DA4"/>
         </w:rPr>
-        <w:t xml:space="preserve"> pts)</w:t>
+        <w:t xml:space="preserve"> </w:t>
+      </w:r>
+      <w:proofErr w:type="spellStart"/>
+      <w:r>
+        <w:rPr>
+          <w:b/>
+          <w:bCs/>
+          <w:color w:val="2E6DA4"/>
+        </w:rPr>
+        <w:t>pts</w:t>
+      </w:r>
+      <w:proofErr w:type="spellEnd"/>
+      <w:r>
+        <w:rPr>
+          <w:b/>
+          <w:bCs/>
+          <w:color w:val="2E6DA4"/>
+        </w:rPr>
+        <w:t>)</w:t>
       </w:r>
     </w:p>
     <w:p>
@@ -5816,10 +6620,7 @@
         <w:spacing w:before="60" w:after="80"/>
       </w:pPr>
       <w:r>
-        <w:t xml:space="preserve">Muestra el título del videojuego y el </w:t>
-      </w:r>
-      <w:r>
-        <w:t>nombre del género para todos los juegos que pertenezcan al género 'RPG' o 'Terror'. Debes usar JOIN para unir las tablas VIDEOJUEGO y GENERO.</w:t>
+        <w:t>Muestra el título del videojuego y el nombre del género para todos los juegos que pertenezcan al género 'RPG' o 'Terror'. Debes usar JOIN para unir las tablas VIDEOJUEGO y GENERO.</w:t>
       </w:r>
     </w:p>
     <w:p>
@@ -5965,12 +6766,21 @@
             </w:tcMar>
           </w:tcPr>
           <w:p>
-            <w:r>
-              <w:rPr>
-                <w:sz w:val="20"/>
-                <w:szCs w:val="20"/>
-              </w:rPr>
-              <w:t>VIDEOJUEGO  JOIN  GENERO</w:t>
+            <w:proofErr w:type="gramStart"/>
+            <w:r>
+              <w:rPr>
+                <w:sz w:val="20"/>
+                <w:szCs w:val="20"/>
+              </w:rPr>
+              <w:t>VIDEOJUEGO  JOIN</w:t>
+            </w:r>
+            <w:proofErr w:type="gramEnd"/>
+            <w:r>
+              <w:rPr>
+                <w:sz w:val="20"/>
+                <w:szCs w:val="20"/>
+              </w:rPr>
+              <w:t xml:space="preserve">  GENERO</w:t>
             </w:r>
           </w:p>
         </w:tc>
@@ -6077,12 +6887,23 @@
             </w:tcMar>
           </w:tcPr>
           <w:p>
-            <w:r>
-              <w:rPr>
-                <w:sz w:val="20"/>
-                <w:szCs w:val="20"/>
-              </w:rPr>
-              <w:t>G.nombre IN ('RPG', 'Terror')</w:t>
+            <w:proofErr w:type="spellStart"/>
+            <w:proofErr w:type="gramStart"/>
+            <w:r>
+              <w:rPr>
+                <w:sz w:val="20"/>
+                <w:szCs w:val="20"/>
+              </w:rPr>
+              <w:t>G.nombre</w:t>
+            </w:r>
+            <w:proofErr w:type="spellEnd"/>
+            <w:proofErr w:type="gramEnd"/>
+            <w:r>
+              <w:rPr>
+                <w:sz w:val="20"/>
+                <w:szCs w:val="20"/>
+              </w:rPr>
+              <w:t xml:space="preserve"> IN ('RPG', 'Terror')</w:t>
             </w:r>
           </w:p>
         </w:tc>
@@ -6161,6 +6982,56 @@
       </w:r>
       <w:r>
         <w:t>3</w:t>
+      </w:r>
+      <w:r>
+        <w:br/>
+        <w:t>(no tenemos genero terror)</w:t>
+      </w:r>
+    </w:p>
+    <w:p>
+      <w:pPr>
+        <w:spacing w:before="60" w:after="60"/>
+      </w:pPr>
+      <w:r>
+        <w:rPr>
+          <w:noProof/>
+        </w:rPr>
+        <w:lastRenderedPageBreak/>
+        <w:drawing>
+          <wp:inline distT="0" distB="0" distL="0" distR="0" wp14:anchorId="1E616C0C" wp14:editId="1C26E2AD">
+            <wp:extent cx="5805210" cy="1657350"/>
+            <wp:effectExtent l="0" t="0" r="5080" b="0"/>
+            <wp:docPr id="11" name="Imagen 11"/>
+            <wp:cNvGraphicFramePr>
+              <a:graphicFrameLocks xmlns:a="http://schemas.openxmlformats.org/drawingml/2006/main" noChangeAspect="1"/>
+            </wp:cNvGraphicFramePr>
+            <a:graphic xmlns:a="http://schemas.openxmlformats.org/drawingml/2006/main">
+              <a:graphicData uri="http://schemas.openxmlformats.org/drawingml/2006/picture">
+                <pic:pic xmlns:pic="http://schemas.openxmlformats.org/drawingml/2006/picture">
+                  <pic:nvPicPr>
+                    <pic:cNvPr id="1" name=""/>
+                    <pic:cNvPicPr/>
+                  </pic:nvPicPr>
+                  <pic:blipFill>
+                    <a:blip r:embed="rId16"/>
+                    <a:stretch>
+                      <a:fillRect/>
+                    </a:stretch>
+                  </pic:blipFill>
+                  <pic:spPr>
+                    <a:xfrm>
+                      <a:off x="0" y="0"/>
+                      <a:ext cx="6626982" cy="1891961"/>
+                    </a:xfrm>
+                    <a:prstGeom prst="rect">
+                      <a:avLst/>
+                    </a:prstGeom>
+                  </pic:spPr>
+                </pic:pic>
+              </a:graphicData>
+            </a:graphic>
+          </wp:inline>
+        </w:drawing>
       </w:r>
     </w:p>
     <w:p>
@@ -6182,8 +7053,19 @@
           <w:color w:val="2E6DA4"/>
           <w:lang w:val="en-US"/>
         </w:rPr>
-        <w:t>Consulta 4 — Con COUNT, GROUP BY y HAVING  (</w:t>
-      </w:r>
+        <w:t xml:space="preserve">Consulta 4 — Con COUNT, GROUP BY y </w:t>
+      </w:r>
+      <w:proofErr w:type="gramStart"/>
+      <w:r>
+        <w:rPr>
+          <w:b/>
+          <w:bCs/>
+          <w:color w:val="2E6DA4"/>
+          <w:lang w:val="en-US"/>
+        </w:rPr>
+        <w:t>HAVING  (</w:t>
+      </w:r>
+      <w:proofErr w:type="gramEnd"/>
       <w:r>
         <w:rPr>
           <w:b/>
@@ -6208,10 +7090,15 @@
         <w:spacing w:before="60" w:after="80"/>
       </w:pPr>
       <w:r>
-        <w:t xml:space="preserve">Obtén cuántos videojuegos hay registrados por cada género. Muestra el nombre del género y la cantidad de juegos </w:t>
-      </w:r>
-      <w:r>
-        <w:t>usando un alias llamado total_juegos. Incluye solo los géneros que tengan al menos 2 juegos registrados.</w:t>
+        <w:t xml:space="preserve">Obtén cuántos videojuegos hay registrados por cada género. Muestra el nombre del género y la cantidad de juegos usando un alias llamado </w:t>
+      </w:r>
+      <w:proofErr w:type="spellStart"/>
+      <w:r>
+        <w:t>total_juegos</w:t>
+      </w:r>
+      <w:proofErr w:type="spellEnd"/>
+      <w:r>
+        <w:t>. Incluye solo los géneros que tengan al menos 2 juegos registrados.</w:t>
       </w:r>
     </w:p>
     <w:p>
@@ -6357,12 +7244,21 @@
             </w:tcMar>
           </w:tcPr>
           <w:p>
-            <w:r>
-              <w:rPr>
-                <w:sz w:val="20"/>
-                <w:szCs w:val="20"/>
-              </w:rPr>
-              <w:t>GENERO  JOIN  VIDEOJUEGO</w:t>
+            <w:proofErr w:type="gramStart"/>
+            <w:r>
+              <w:rPr>
+                <w:sz w:val="20"/>
+                <w:szCs w:val="20"/>
+              </w:rPr>
+              <w:t>GENERO  JOIN</w:t>
+            </w:r>
+            <w:proofErr w:type="gramEnd"/>
+            <w:r>
+              <w:rPr>
+                <w:sz w:val="20"/>
+                <w:szCs w:val="20"/>
+              </w:rPr>
+              <w:t xml:space="preserve">  VIDEOJUEGO</w:t>
             </w:r>
           </w:p>
         </w:tc>
@@ -6413,13 +7309,49 @@
             </w:tcMar>
           </w:tcPr>
           <w:p>
-            <w:r>
-              <w:rPr>
-                <w:sz w:val="20"/>
-                <w:szCs w:val="20"/>
-              </w:rPr>
-              <w:t>G.nombre AS genero,  COUNT(...) AS total_juegos</w:t>
-            </w:r>
+            <w:proofErr w:type="spellStart"/>
+            <w:proofErr w:type="gramStart"/>
+            <w:r>
+              <w:rPr>
+                <w:sz w:val="20"/>
+                <w:szCs w:val="20"/>
+              </w:rPr>
+              <w:t>G.nombre</w:t>
+            </w:r>
+            <w:proofErr w:type="spellEnd"/>
+            <w:proofErr w:type="gramEnd"/>
+            <w:r>
+              <w:rPr>
+                <w:sz w:val="20"/>
+                <w:szCs w:val="20"/>
+              </w:rPr>
+              <w:t xml:space="preserve"> AS </w:t>
+            </w:r>
+            <w:proofErr w:type="spellStart"/>
+            <w:r>
+              <w:rPr>
+                <w:sz w:val="20"/>
+                <w:szCs w:val="20"/>
+              </w:rPr>
+              <w:t>genero</w:t>
+            </w:r>
+            <w:proofErr w:type="spellEnd"/>
+            <w:r>
+              <w:rPr>
+                <w:sz w:val="20"/>
+                <w:szCs w:val="20"/>
+              </w:rPr>
+              <w:t xml:space="preserve">,  COUNT(...) AS </w:t>
+            </w:r>
+            <w:proofErr w:type="spellStart"/>
+            <w:r>
+              <w:rPr>
+                <w:sz w:val="20"/>
+                <w:szCs w:val="20"/>
+              </w:rPr>
+              <w:t>total_juegos</w:t>
+            </w:r>
+            <w:proofErr w:type="spellEnd"/>
           </w:p>
         </w:tc>
       </w:tr>
@@ -6474,14 +7406,23 @@
                 <w:sz w:val="20"/>
                 <w:szCs w:val="20"/>
               </w:rPr>
-              <w:t>GROUP BY id_genero y nombre del</w:t>
-            </w:r>
-            <w:r>
-              <w:rPr>
-                <w:sz w:val="20"/>
-                <w:szCs w:val="20"/>
-              </w:rPr>
-              <w:t xml:space="preserve"> género</w:t>
+              <w:t xml:space="preserve">GROUP BY </w:t>
+            </w:r>
+            <w:proofErr w:type="spellStart"/>
+            <w:r>
+              <w:rPr>
+                <w:sz w:val="20"/>
+                <w:szCs w:val="20"/>
+              </w:rPr>
+              <w:t>id_genero</w:t>
+            </w:r>
+            <w:proofErr w:type="spellEnd"/>
+            <w:r>
+              <w:rPr>
+                <w:sz w:val="20"/>
+                <w:szCs w:val="20"/>
+              </w:rPr>
+              <w:t xml:space="preserve"> y nombre del género</w:t>
             </w:r>
           </w:p>
         </w:tc>
@@ -6537,7 +7478,23 @@
                 <w:sz w:val="20"/>
                 <w:szCs w:val="20"/>
               </w:rPr>
-              <w:t>HAVING total_juegos &gt;= 2</w:t>
+              <w:t xml:space="preserve">HAVING </w:t>
+            </w:r>
+            <w:proofErr w:type="spellStart"/>
+            <w:r>
+              <w:rPr>
+                <w:sz w:val="20"/>
+                <w:szCs w:val="20"/>
+              </w:rPr>
+              <w:t>total_juegos</w:t>
+            </w:r>
+            <w:proofErr w:type="spellEnd"/>
+            <w:r>
+              <w:rPr>
+                <w:sz w:val="20"/>
+                <w:szCs w:val="20"/>
+              </w:rPr>
+              <w:t xml:space="preserve"> &gt;= 2</w:t>
             </w:r>
           </w:p>
         </w:tc>
@@ -6588,12 +7545,21 @@
             </w:tcMar>
           </w:tcPr>
           <w:p>
-            <w:r>
-              <w:rPr>
-                <w:sz w:val="20"/>
-                <w:szCs w:val="20"/>
-              </w:rPr>
-              <w:t>total_juegos DESC</w:t>
+            <w:proofErr w:type="spellStart"/>
+            <w:r>
+              <w:rPr>
+                <w:sz w:val="20"/>
+                <w:szCs w:val="20"/>
+              </w:rPr>
+              <w:t>total_juegos</w:t>
+            </w:r>
+            <w:proofErr w:type="spellEnd"/>
+            <w:r>
+              <w:rPr>
+                <w:sz w:val="20"/>
+                <w:szCs w:val="20"/>
+              </w:rPr>
+              <w:t xml:space="preserve"> DESC</w:t>
             </w:r>
           </w:p>
         </w:tc>
@@ -6617,6 +7583,53 @@
       <w:r>
         <w:t>4</w:t>
       </w:r>
+    </w:p>
+    <w:p>
+      <w:pPr>
+        <w:spacing w:before="60" w:after="60"/>
+      </w:pPr>
+      <w:r>
+        <w:drawing>
+          <wp:inline distT="0" distB="0" distL="0" distR="0" wp14:anchorId="5392572F" wp14:editId="7957314E">
+            <wp:extent cx="6172200" cy="2840355"/>
+            <wp:effectExtent l="0" t="0" r="0" b="0"/>
+            <wp:docPr id="13" name="Imagen 13"/>
+            <wp:cNvGraphicFramePr>
+              <a:graphicFrameLocks xmlns:a="http://schemas.openxmlformats.org/drawingml/2006/main" noChangeAspect="1"/>
+            </wp:cNvGraphicFramePr>
+            <a:graphic xmlns:a="http://schemas.openxmlformats.org/drawingml/2006/main">
+              <a:graphicData uri="http://schemas.openxmlformats.org/drawingml/2006/picture">
+                <pic:pic xmlns:pic="http://schemas.openxmlformats.org/drawingml/2006/picture">
+                  <pic:nvPicPr>
+                    <pic:cNvPr id="1" name=""/>
+                    <pic:cNvPicPr/>
+                  </pic:nvPicPr>
+                  <pic:blipFill>
+                    <a:blip r:embed="rId17"/>
+                    <a:stretch>
+                      <a:fillRect/>
+                    </a:stretch>
+                  </pic:blipFill>
+                  <pic:spPr>
+                    <a:xfrm>
+                      <a:off x="0" y="0"/>
+                      <a:ext cx="6172200" cy="2840355"/>
+                    </a:xfrm>
+                    <a:prstGeom prst="rect">
+                      <a:avLst/>
+                    </a:prstGeom>
+                  </pic:spPr>
+                </pic:pic>
+              </a:graphicData>
+            </a:graphic>
+          </wp:inline>
+        </w:drawing>
+      </w:r>
+    </w:p>
+    <w:p>
+      <w:pPr>
+        <w:spacing w:before="60" w:after="60"/>
+      </w:pPr>
     </w:p>
     <w:p>
       <w:pPr>
@@ -6633,8 +7646,29 @@
           <w:bCs/>
           <w:color w:val="2E6DA4"/>
         </w:rPr>
-        <w:t>Consulta 5 — Intermedia con múltiples JOINs  (</w:t>
-      </w:r>
+        <w:lastRenderedPageBreak/>
+        <w:t xml:space="preserve">Consulta 5 — Intermedia con múltiples </w:t>
+      </w:r>
+      <w:proofErr w:type="spellStart"/>
+      <w:proofErr w:type="gramStart"/>
+      <w:r>
+        <w:rPr>
+          <w:b/>
+          <w:bCs/>
+          <w:color w:val="2E6DA4"/>
+        </w:rPr>
+        <w:t>JOINs</w:t>
+      </w:r>
+      <w:proofErr w:type="spellEnd"/>
+      <w:r>
+        <w:rPr>
+          <w:b/>
+          <w:bCs/>
+          <w:color w:val="2E6DA4"/>
+        </w:rPr>
+        <w:t xml:space="preserve">  (</w:t>
+      </w:r>
+      <w:proofErr w:type="gramEnd"/>
       <w:r>
         <w:rPr>
           <w:b/>
@@ -6643,13 +7677,23 @@
         </w:rPr>
         <w:t xml:space="preserve">3 </w:t>
       </w:r>
+      <w:proofErr w:type="spellStart"/>
       <w:r>
         <w:rPr>
           <w:b/>
           <w:bCs/>
           <w:color w:val="2E6DA4"/>
         </w:rPr>
-        <w:t>pts)</w:t>
+        <w:t>pts</w:t>
+      </w:r>
+      <w:proofErr w:type="spellEnd"/>
+      <w:r>
+        <w:rPr>
+          <w:b/>
+          <w:bCs/>
+          <w:color w:val="2E6DA4"/>
+        </w:rPr>
+        <w:t>)</w:t>
       </w:r>
     </w:p>
     <w:p>
@@ -6657,10 +7701,15 @@
         <w:spacing w:before="60" w:after="80"/>
       </w:pPr>
       <w:r>
-        <w:t>Lista el título de cada videojuego junto con los nombres de las plataformas en las que está disponible</w:t>
-      </w:r>
-      <w:r>
-        <w:t xml:space="preserve"> y la fecha en que llegó a cada una. Solo incluye juegos que estén disponibles en más de una plataforma. Debes realizar dos JOINs: VIDEOJUEGO → VIDEOJUEGO_PLATAFORMA → PLATAFORMA.</w:t>
+        <w:t xml:space="preserve">Lista el título de cada videojuego junto con los nombres de las plataformas en las que está disponible y la fecha en que llegó a cada una. Solo incluye juegos que estén disponibles en más de una plataforma. Debes realizar dos </w:t>
+      </w:r>
+      <w:proofErr w:type="spellStart"/>
+      <w:r>
+        <w:t>JOINs</w:t>
+      </w:r>
+      <w:proofErr w:type="spellEnd"/>
+      <w:r>
+        <w:t>: VIDEOJUEGO → VIDEOJUEGO_PLATAFORMA → PLATAFORMA.</w:t>
       </w:r>
     </w:p>
     <w:p>
@@ -6806,19 +7855,37 @@
             </w:tcMar>
           </w:tcPr>
           <w:p>
-            <w:r>
-              <w:rPr>
-                <w:sz w:val="20"/>
-                <w:szCs w:val="20"/>
-              </w:rPr>
-              <w:t>VIDEOJUEGO  →  VIDEOJUEGO_PLATAFORMA  →  PLATAFOR</w:t>
-            </w:r>
-            <w:r>
-              <w:rPr>
-                <w:sz w:val="20"/>
-                <w:szCs w:val="20"/>
-              </w:rPr>
-              <w:t>MA  (2 JOINs)</w:t>
+            <w:proofErr w:type="gramStart"/>
+            <w:r>
+              <w:rPr>
+                <w:sz w:val="20"/>
+                <w:szCs w:val="20"/>
+              </w:rPr>
+              <w:t>VIDEOJUEGO  →</w:t>
+            </w:r>
+            <w:proofErr w:type="gramEnd"/>
+            <w:r>
+              <w:rPr>
+                <w:sz w:val="20"/>
+                <w:szCs w:val="20"/>
+              </w:rPr>
+              <w:t xml:space="preserve">  VIDEOJUEGO_PLATAFORMA  →  PLATAFORMA  (2 </w:t>
+            </w:r>
+            <w:proofErr w:type="spellStart"/>
+            <w:r>
+              <w:rPr>
+                <w:sz w:val="20"/>
+                <w:szCs w:val="20"/>
+              </w:rPr>
+              <w:t>JOINs</w:t>
+            </w:r>
+            <w:proofErr w:type="spellEnd"/>
+            <w:r>
+              <w:rPr>
+                <w:sz w:val="20"/>
+                <w:szCs w:val="20"/>
+              </w:rPr>
+              <w:t>)</w:t>
             </w:r>
           </w:p>
         </w:tc>
@@ -6869,13 +7936,31 @@
             </w:tcMar>
           </w:tcPr>
           <w:p>
-            <w:r>
-              <w:rPr>
-                <w:sz w:val="20"/>
-                <w:szCs w:val="20"/>
-              </w:rPr>
-              <w:t>titulo, nombre de plataforma, fecha_disponible</w:t>
-            </w:r>
+            <w:proofErr w:type="spellStart"/>
+            <w:r>
+              <w:rPr>
+                <w:sz w:val="20"/>
+                <w:szCs w:val="20"/>
+              </w:rPr>
+              <w:t>titulo</w:t>
+            </w:r>
+            <w:proofErr w:type="spellEnd"/>
+            <w:r>
+              <w:rPr>
+                <w:sz w:val="20"/>
+                <w:szCs w:val="20"/>
+              </w:rPr>
+              <w:t xml:space="preserve">, nombre de plataforma, </w:t>
+            </w:r>
+            <w:proofErr w:type="spellStart"/>
+            <w:r>
+              <w:rPr>
+                <w:sz w:val="20"/>
+                <w:szCs w:val="20"/>
+              </w:rPr>
+              <w:t>fecha_disponible</w:t>
+            </w:r>
+            <w:proofErr w:type="spellEnd"/>
           </w:p>
         </w:tc>
       </w:tr>
@@ -6981,12 +8066,37 @@
             </w:tcMar>
           </w:tcPr>
           <w:p>
-            <w:r>
-              <w:rPr>
-                <w:sz w:val="20"/>
-                <w:szCs w:val="20"/>
-              </w:rPr>
-              <w:t>titulo ASC, fecha_disponible ASC</w:t>
+            <w:proofErr w:type="spellStart"/>
+            <w:r>
+              <w:rPr>
+                <w:sz w:val="20"/>
+                <w:szCs w:val="20"/>
+              </w:rPr>
+              <w:t>titulo</w:t>
+            </w:r>
+            <w:proofErr w:type="spellEnd"/>
+            <w:r>
+              <w:rPr>
+                <w:sz w:val="20"/>
+                <w:szCs w:val="20"/>
+              </w:rPr>
+              <w:t xml:space="preserve"> ASC, </w:t>
+            </w:r>
+            <w:proofErr w:type="spellStart"/>
+            <w:r>
+              <w:rPr>
+                <w:sz w:val="20"/>
+                <w:szCs w:val="20"/>
+              </w:rPr>
+              <w:t>fecha_disponible</w:t>
+            </w:r>
+            <w:proofErr w:type="spellEnd"/>
+            <w:r>
+              <w:rPr>
+                <w:sz w:val="20"/>
+                <w:szCs w:val="20"/>
+              </w:rPr>
+              <w:t xml:space="preserve"> ASC</w:t>
             </w:r>
           </w:p>
         </w:tc>
@@ -7010,11 +8120,52 @@
         <w:rPr>
           <w:highlight w:val="yellow"/>
         </w:rPr>
-        <w:lastRenderedPageBreak/>
         <w:t xml:space="preserve">PONER EVIDENCIA CONSULTA </w:t>
       </w:r>
       <w:r>
         <w:t>5</w:t>
+      </w:r>
+    </w:p>
+    <w:p>
+      <w:pPr>
+        <w:spacing w:before="60" w:after="60"/>
+      </w:pPr>
+      <w:r>
+        <w:drawing>
+          <wp:inline distT="0" distB="0" distL="0" distR="0" wp14:anchorId="4FF9DBBE" wp14:editId="2A97EFBD">
+            <wp:extent cx="6172200" cy="2786380"/>
+            <wp:effectExtent l="0" t="0" r="0" b="0"/>
+            <wp:docPr id="14" name="Imagen 14"/>
+            <wp:cNvGraphicFramePr>
+              <a:graphicFrameLocks xmlns:a="http://schemas.openxmlformats.org/drawingml/2006/main" noChangeAspect="1"/>
+            </wp:cNvGraphicFramePr>
+            <a:graphic xmlns:a="http://schemas.openxmlformats.org/drawingml/2006/main">
+              <a:graphicData uri="http://schemas.openxmlformats.org/drawingml/2006/picture">
+                <pic:pic xmlns:pic="http://schemas.openxmlformats.org/drawingml/2006/picture">
+                  <pic:nvPicPr>
+                    <pic:cNvPr id="1" name=""/>
+                    <pic:cNvPicPr/>
+                  </pic:nvPicPr>
+                  <pic:blipFill>
+                    <a:blip r:embed="rId18"/>
+                    <a:stretch>
+                      <a:fillRect/>
+                    </a:stretch>
+                  </pic:blipFill>
+                  <pic:spPr>
+                    <a:xfrm>
+                      <a:off x="0" y="0"/>
+                      <a:ext cx="6172200" cy="2786380"/>
+                    </a:xfrm>
+                    <a:prstGeom prst="rect">
+                      <a:avLst/>
+                    </a:prstGeom>
+                  </pic:spPr>
+                </pic:pic>
+              </a:graphicData>
+            </a:graphic>
+          </wp:inline>
+        </w:drawing>
       </w:r>
     </w:p>
     <w:p>
@@ -7034,7 +8185,7 @@
 </file>
 
 <file path=word/endnotes.xml><?xml version="1.0" encoding="utf-8"?>
-<w:endnotes xmlns:wpc="http://schemas.microsoft.com/office/word/2010/wordprocessingCanvas" xmlns:cx="http://schemas.microsoft.com/office/drawing/2014/chartex" xmlns:mc="http://schemas.openxmlformats.org/markup-compatibility/2006" xmlns:o="urn:schemas-microsoft-com:office:office" xmlns:r="http://schemas.openxmlformats.org/officeDocument/2006/relationships" xmlns:m="http://schemas.openxmlformats.org/officeDocument/2006/math" xmlns:v="urn:schemas-microsoft-com:vml" xmlns:wp14="http://schemas.microsoft.com/office/word/2010/wordprocessingDrawing" xmlns:wp="http://schemas.openxmlformats.org/drawingml/2006/wordprocessingDrawing" xmlns:w10="urn:schemas-microsoft-com:office:word" xmlns:w="http://schemas.openxmlformats.org/wordprocessingml/2006/main" xmlns:w14="http://schemas.microsoft.com/office/word/2010/wordml" xmlns:w15="http://schemas.microsoft.com/office/word/2012/wordml" xmlns:w16se="http://schemas.microsoft.com/office/word/2015/wordml/symex" xmlns:wpg="http://schemas.microsoft.com/office/word/2010/wordprocessingGroup" xmlns:wpi="http://schemas.microsoft.com/office/word/2010/wordprocessingInk" xmlns:wne="http://schemas.microsoft.com/office/word/2006/wordml" xmlns:wps="http://schemas.microsoft.com/office/word/2010/wordprocessingShape" mc:Ignorable="w14 w15 w16se wp14">
+<w:endnotes xmlns:wpc="http://schemas.microsoft.com/office/word/2010/wordprocessingCanvas" xmlns:cx="http://schemas.microsoft.com/office/drawing/2014/chartex" xmlns:cx1="http://schemas.microsoft.com/office/drawing/2015/9/8/chartex" xmlns:cx2="http://schemas.microsoft.com/office/drawing/2015/10/21/chartex" xmlns:cx3="http://schemas.microsoft.com/office/drawing/2016/5/9/chartex" xmlns:cx4="http://schemas.microsoft.com/office/drawing/2016/5/10/chartex" xmlns:cx5="http://schemas.microsoft.com/office/drawing/2016/5/11/chartex" xmlns:cx6="http://schemas.microsoft.com/office/drawing/2016/5/12/chartex" xmlns:cx7="http://schemas.microsoft.com/office/drawing/2016/5/13/chartex" xmlns:cx8="http://schemas.microsoft.com/office/drawing/2016/5/14/chartex" xmlns:mc="http://schemas.openxmlformats.org/markup-compatibility/2006" xmlns:aink="http://schemas.microsoft.com/office/drawing/2016/ink" xmlns:am3d="http://schemas.microsoft.com/office/drawing/2017/model3d" xmlns:o="urn:schemas-microsoft-com:office:office" xmlns:r="http://schemas.openxmlformats.org/officeDocument/2006/relationships" xmlns:m="http://schemas.openxmlformats.org/officeDocument/2006/math" xmlns:v="urn:schemas-microsoft-com:vml" xmlns:wp14="http://schemas.microsoft.com/office/word/2010/wordprocessingDrawing" xmlns:wp="http://schemas.openxmlformats.org/drawingml/2006/wordprocessingDrawing" xmlns:w10="urn:schemas-microsoft-com:office:word" xmlns:w="http://schemas.openxmlformats.org/wordprocessingml/2006/main" xmlns:w14="http://schemas.microsoft.com/office/word/2010/wordml" xmlns:w15="http://schemas.microsoft.com/office/word/2012/wordml" xmlns:w16cex="http://schemas.microsoft.com/office/word/2018/wordml/cex" xmlns:w16cid="http://schemas.microsoft.com/office/word/2016/wordml/cid" xmlns:w16="http://schemas.microsoft.com/office/word/2018/wordml" xmlns:w16sdtdh="http://schemas.microsoft.com/office/word/2020/wordml/sdtdatahash" xmlns:w16se="http://schemas.microsoft.com/office/word/2015/wordml/symex" xmlns:wpg="http://schemas.microsoft.com/office/word/2010/wordprocessingGroup" xmlns:wpi="http://schemas.microsoft.com/office/word/2010/wordprocessingInk" xmlns:wne="http://schemas.microsoft.com/office/word/2006/wordml" xmlns:wps="http://schemas.microsoft.com/office/word/2010/wordprocessingShape" mc:Ignorable="w14 w15 w16se w16cid w16 w16cex w16sdtdh wp14">
   <w:endnote w:type="separator" w:id="-1">
     <w:p>
       <w:r>
@@ -7053,7 +8204,7 @@
 </file>
 
 <file path=word/footnotes.xml><?xml version="1.0" encoding="utf-8"?>
-<w:footnotes xmlns:wpc="http://schemas.microsoft.com/office/word/2010/wordprocessingCanvas" xmlns:cx="http://schemas.microsoft.com/office/drawing/2014/chartex" xmlns:mc="http://schemas.openxmlformats.org/markup-compatibility/2006" xmlns:o="urn:schemas-microsoft-com:office:office" xmlns:r="http://schemas.openxmlformats.org/officeDocument/2006/relationships" xmlns:m="http://schemas.openxmlformats.org/officeDocument/2006/math" xmlns:v="urn:schemas-microsoft-com:vml" xmlns:wp14="http://schemas.microsoft.com/office/word/2010/wordprocessingDrawing" xmlns:wp="http://schemas.openxmlformats.org/drawingml/2006/wordprocessingDrawing" xmlns:w10="urn:schemas-microsoft-com:office:word" xmlns:w="http://schemas.openxmlformats.org/wordprocessingml/2006/main" xmlns:w14="http://schemas.microsoft.com/office/word/2010/wordml" xmlns:w15="http://schemas.microsoft.com/office/word/2012/wordml" xmlns:w16se="http://schemas.microsoft.com/office/word/2015/wordml/symex" xmlns:wpg="http://schemas.microsoft.com/office/word/2010/wordprocessingGroup" xmlns:wpi="http://schemas.microsoft.com/office/word/2010/wordprocessingInk" xmlns:wne="http://schemas.microsoft.com/office/word/2006/wordml" xmlns:wps="http://schemas.microsoft.com/office/word/2010/wordprocessingShape" mc:Ignorable="w14 w15 w16se wp14">
+<w:footnotes xmlns:wpc="http://schemas.microsoft.com/office/word/2010/wordprocessingCanvas" xmlns:cx="http://schemas.microsoft.com/office/drawing/2014/chartex" xmlns:cx1="http://schemas.microsoft.com/office/drawing/2015/9/8/chartex" xmlns:cx2="http://schemas.microsoft.com/office/drawing/2015/10/21/chartex" xmlns:cx3="http://schemas.microsoft.com/office/drawing/2016/5/9/chartex" xmlns:cx4="http://schemas.microsoft.com/office/drawing/2016/5/10/chartex" xmlns:cx5="http://schemas.microsoft.com/office/drawing/2016/5/11/chartex" xmlns:cx6="http://schemas.microsoft.com/office/drawing/2016/5/12/chartex" xmlns:cx7="http://schemas.microsoft.com/office/drawing/2016/5/13/chartex" xmlns:cx8="http://schemas.microsoft.com/office/drawing/2016/5/14/chartex" xmlns:mc="http://schemas.openxmlformats.org/markup-compatibility/2006" xmlns:aink="http://schemas.microsoft.com/office/drawing/2016/ink" xmlns:am3d="http://schemas.microsoft.com/office/drawing/2017/model3d" xmlns:o="urn:schemas-microsoft-com:office:office" xmlns:r="http://schemas.openxmlformats.org/officeDocument/2006/relationships" xmlns:m="http://schemas.openxmlformats.org/officeDocument/2006/math" xmlns:v="urn:schemas-microsoft-com:vml" xmlns:wp14="http://schemas.microsoft.com/office/word/2010/wordprocessingDrawing" xmlns:wp="http://schemas.openxmlformats.org/drawingml/2006/wordprocessingDrawing" xmlns:w10="urn:schemas-microsoft-com:office:word" xmlns:w="http://schemas.openxmlformats.org/wordprocessingml/2006/main" xmlns:w14="http://schemas.microsoft.com/office/word/2010/wordml" xmlns:w15="http://schemas.microsoft.com/office/word/2012/wordml" xmlns:w16cex="http://schemas.microsoft.com/office/word/2018/wordml/cex" xmlns:w16cid="http://schemas.microsoft.com/office/word/2016/wordml/cid" xmlns:w16="http://schemas.microsoft.com/office/word/2018/wordml" xmlns:w16sdtdh="http://schemas.microsoft.com/office/word/2020/wordml/sdtdatahash" xmlns:w16se="http://schemas.microsoft.com/office/word/2015/wordml/symex" xmlns:wpg="http://schemas.microsoft.com/office/word/2010/wordprocessingGroup" xmlns:wpi="http://schemas.microsoft.com/office/word/2010/wordprocessingInk" xmlns:wne="http://schemas.microsoft.com/office/word/2006/wordml" xmlns:wps="http://schemas.microsoft.com/office/word/2010/wordprocessingShape" mc:Ignorable="w14 w15 w16se w16cid w16 w16cex w16sdtdh wp14">
   <w:footnote w:type="separator" w:id="-1">
     <w:p>
       <w:r>
@@ -7072,7 +8223,7 @@
 </file>
 
 <file path=word/numbering.xml><?xml version="1.0" encoding="utf-8"?>
-<w:numbering xmlns:wpc="http://schemas.microsoft.com/office/word/2010/wordprocessingCanvas" xmlns:cx="http://schemas.microsoft.com/office/drawing/2014/chartex" xmlns:mc="http://schemas.openxmlformats.org/markup-compatibility/2006" xmlns:o="urn:schemas-microsoft-com:office:office" xmlns:r="http://schemas.openxmlformats.org/officeDocument/2006/relationships" xmlns:m="http://schemas.openxmlformats.org/officeDocument/2006/math" xmlns:v="urn:schemas-microsoft-com:vml" xmlns:wp14="http://schemas.microsoft.com/office/word/2010/wordprocessingDrawing" xmlns:wp="http://schemas.openxmlformats.org/drawingml/2006/wordprocessingDrawing" xmlns:w10="urn:schemas-microsoft-com:office:word" xmlns:w="http://schemas.openxmlformats.org/wordprocessingml/2006/main" xmlns:w14="http://schemas.microsoft.com/office/word/2010/wordml" xmlns:w15="http://schemas.microsoft.com/office/word/2012/wordml" xmlns:w16se="http://schemas.microsoft.com/office/word/2015/wordml/symex" xmlns:wpg="http://schemas.microsoft.com/office/word/2010/wordprocessingGroup" xmlns:wpi="http://schemas.microsoft.com/office/word/2010/wordprocessingInk" xmlns:wne="http://schemas.microsoft.com/office/word/2006/wordml" xmlns:wps="http://schemas.microsoft.com/office/word/2010/wordprocessingShape" mc:Ignorable="w14 w15 w16se wp14">
+<w:numbering xmlns:wpc="http://schemas.microsoft.com/office/word/2010/wordprocessingCanvas" xmlns:cx="http://schemas.microsoft.com/office/drawing/2014/chartex" xmlns:cx1="http://schemas.microsoft.com/office/drawing/2015/9/8/chartex" xmlns:cx2="http://schemas.microsoft.com/office/drawing/2015/10/21/chartex" xmlns:cx3="http://schemas.microsoft.com/office/drawing/2016/5/9/chartex" xmlns:cx4="http://schemas.microsoft.com/office/drawing/2016/5/10/chartex" xmlns:cx5="http://schemas.microsoft.com/office/drawing/2016/5/11/chartex" xmlns:cx6="http://schemas.microsoft.com/office/drawing/2016/5/12/chartex" xmlns:cx7="http://schemas.microsoft.com/office/drawing/2016/5/13/chartex" xmlns:cx8="http://schemas.microsoft.com/office/drawing/2016/5/14/chartex" xmlns:mc="http://schemas.openxmlformats.org/markup-compatibility/2006" xmlns:aink="http://schemas.microsoft.com/office/drawing/2016/ink" xmlns:am3d="http://schemas.microsoft.com/office/drawing/2017/model3d" xmlns:o="urn:schemas-microsoft-com:office:office" xmlns:r="http://schemas.openxmlformats.org/officeDocument/2006/relationships" xmlns:m="http://schemas.openxmlformats.org/officeDocument/2006/math" xmlns:v="urn:schemas-microsoft-com:vml" xmlns:wp14="http://schemas.microsoft.com/office/word/2010/wordprocessingDrawing" xmlns:wp="http://schemas.openxmlformats.org/drawingml/2006/wordprocessingDrawing" xmlns:w10="urn:schemas-microsoft-com:office:word" xmlns:w="http://schemas.openxmlformats.org/wordprocessingml/2006/main" xmlns:w14="http://schemas.microsoft.com/office/word/2010/wordml" xmlns:w15="http://schemas.microsoft.com/office/word/2012/wordml" xmlns:w16cex="http://schemas.microsoft.com/office/word/2018/wordml/cex" xmlns:w16cid="http://schemas.microsoft.com/office/word/2016/wordml/cid" xmlns:w16="http://schemas.microsoft.com/office/word/2018/wordml" xmlns:w16sdtdh="http://schemas.microsoft.com/office/word/2020/wordml/sdtdatahash" xmlns:w16se="http://schemas.microsoft.com/office/word/2015/wordml/symex" xmlns:wpg="http://schemas.microsoft.com/office/word/2010/wordprocessingGroup" xmlns:wpi="http://schemas.microsoft.com/office/word/2010/wordprocessingInk" xmlns:wne="http://schemas.microsoft.com/office/word/2006/wordml" xmlns:wps="http://schemas.microsoft.com/office/word/2010/wordprocessingShape" mc:Ignorable="w14 w15 w16se w16cid w16 w16cex w16sdtdh wp14">
   <w:abstractNum w:abstractNumId="0" w15:restartNumberingAfterBreak="0">
     <w:nsid w:val="01195A7E"/>
     <w:multiLevelType w:val="hybridMultilevel"/>
@@ -7283,7 +8434,7 @@
 </file>
 
 <file path=word/styles.xml><?xml version="1.0" encoding="utf-8"?>
-<w:styles xmlns:mc="http://schemas.openxmlformats.org/markup-compatibility/2006" xmlns:r="http://schemas.openxmlformats.org/officeDocument/2006/relationships" xmlns:w="http://schemas.openxmlformats.org/wordprocessingml/2006/main" xmlns:w14="http://schemas.microsoft.com/office/word/2010/wordml" xmlns:w15="http://schemas.microsoft.com/office/word/2012/wordml" xmlns:w16se="http://schemas.microsoft.com/office/word/2015/wordml/symex" mc:Ignorable="w14 w15 w16se">
+<w:styles xmlns:mc="http://schemas.openxmlformats.org/markup-compatibility/2006" xmlns:r="http://schemas.openxmlformats.org/officeDocument/2006/relationships" xmlns:w="http://schemas.openxmlformats.org/wordprocessingml/2006/main" xmlns:w14="http://schemas.microsoft.com/office/word/2010/wordml" xmlns:w15="http://schemas.microsoft.com/office/word/2012/wordml" xmlns:w16cex="http://schemas.microsoft.com/office/word/2018/wordml/cex" xmlns:w16cid="http://schemas.microsoft.com/office/word/2016/wordml/cid" xmlns:w16="http://schemas.microsoft.com/office/word/2018/wordml" xmlns:w16sdtdh="http://schemas.microsoft.com/office/word/2020/wordml/sdtdatahash" xmlns:w16se="http://schemas.microsoft.com/office/word/2015/wordml/symex" mc:Ignorable="w14 w15 w16se w16cid w16 w16cex w16sdtdh">
   <w:docDefaults>
     <w:rPrDefault>
       <w:rPr>
@@ -7295,7 +8446,7 @@
     </w:rPrDefault>
     <w:pPrDefault/>
   </w:docDefaults>
-  <w:latentStyles w:defLockedState="0" w:defUIPriority="99" w:defSemiHidden="0" w:defUnhideWhenUsed="0" w:defQFormat="0" w:count="371">
+  <w:latentStyles w:defLockedState="0" w:defUIPriority="99" w:defSemiHidden="0" w:defUnhideWhenUsed="0" w:defQFormat="0" w:count="376">
     <w:lsdException w:name="Normal" w:uiPriority="0" w:qFormat="1"/>
     <w:lsdException w:name="heading 1" w:uiPriority="9" w:qFormat="1"/>
     <w:lsdException w:name="heading 2" w:semiHidden="1" w:uiPriority="9" w:unhideWhenUsed="1" w:qFormat="1"/>
@@ -7401,7 +8552,6 @@
     <w:lsdException w:name="HTML Sample" w:semiHidden="1" w:unhideWhenUsed="1"/>
     <w:lsdException w:name="HTML Typewriter" w:semiHidden="1" w:unhideWhenUsed="1"/>
     <w:lsdException w:name="HTML Variable" w:semiHidden="1" w:unhideWhenUsed="1"/>
-    <w:lsdException w:name="Normal Table" w:semiHidden="1" w:unhideWhenUsed="1"/>
     <w:lsdException w:name="annotation subject" w:semiHidden="1" w:unhideWhenUsed="1"/>
     <w:lsdException w:name="No List" w:semiHidden="1" w:unhideWhenUsed="1"/>
     <w:lsdException w:name="Outline List 1" w:semiHidden="1" w:unhideWhenUsed="1"/>
@@ -7444,11 +8594,8 @@
     <w:lsdException w:name="Table Contemporary" w:semiHidden="1" w:unhideWhenUsed="1"/>
     <w:lsdException w:name="Table Elegant" w:semiHidden="1" w:unhideWhenUsed="1"/>
     <w:lsdException w:name="Table Professional" w:semiHidden="1" w:unhideWhenUsed="1"/>
-    <w:lsdException w:name="Table Subtle 1" w:semiHidden="1" w:unhideWhenUsed="1"/>
     <w:lsdException w:name="Table Subtle 2" w:semiHidden="1" w:unhideWhenUsed="1"/>
     <w:lsdException w:name="Table Web 1" w:semiHidden="1" w:unhideWhenUsed="1"/>
-    <w:lsdException w:name="Table Web 2" w:semiHidden="1" w:unhideWhenUsed="1"/>
-    <w:lsdException w:name="Table Web 3" w:semiHidden="1" w:unhideWhenUsed="1"/>
     <w:lsdException w:name="Balloon Text" w:semiHidden="1" w:unhideWhenUsed="1"/>
     <w:lsdException w:name="Table Grid" w:uiPriority="39"/>
     <w:lsdException w:name="Table Theme" w:semiHidden="1" w:unhideWhenUsed="1"/>
@@ -7667,6 +8814,11 @@
     <w:lsdException w:name="List Table 5 Dark Accent 6" w:uiPriority="50"/>
     <w:lsdException w:name="List Table 6 Colorful Accent 6" w:uiPriority="51"/>
     <w:lsdException w:name="List Table 7 Colorful Accent 6" w:uiPriority="52"/>
+    <w:lsdException w:name="Mention" w:semiHidden="1" w:unhideWhenUsed="1"/>
+    <w:lsdException w:name="Smart Hyperlink" w:semiHidden="1" w:unhideWhenUsed="1"/>
+    <w:lsdException w:name="Hashtag" w:semiHidden="1" w:unhideWhenUsed="1"/>
+    <w:lsdException w:name="Unresolved Mention" w:semiHidden="1" w:unhideWhenUsed="1"/>
+    <w:lsdException w:name="Smart Link" w:semiHidden="1" w:unhideWhenUsed="1"/>
   </w:latentStyles>
   <w:style w:type="paragraph" w:default="1" w:styleId="Normal">
     <w:name w:val="Normal"/>

</xml_diff>